<commit_message>
docs: update README to reflect 7-container HA cluster and DR test scenarios
</commit_message>
<xml_diff>
--- a/ELASTIC API GATEWAY DENGAN TRAFFIC.docx
+++ b/ELASTIC API GATEWAY DENGAN TRAFFIC.docx
@@ -1045,7 +1045,135 @@
           <w:rFonts w:eastAsiaTheme="majorEastAsia"/>
           <w:lang w:val="en-ID"/>
         </w:rPr>
-        <w:t>): Berperan sebagai reverse proxy, router protokol HTTP (Port 80 publik), penegak kebijakan rate limiting, dan pemutus sirkuit (</w:t>
+        <w:t xml:space="preserve">): </w:t>
+      </w:r>
+      <w:proofErr w:type="spellStart"/>
+      <w:r>
+        <w:rPr>
+          <w:rFonts w:eastAsiaTheme="majorEastAsia"/>
+          <w:lang w:val="en-ID"/>
+        </w:rPr>
+        <w:t>Berperan</w:t>
+      </w:r>
+      <w:proofErr w:type="spellEnd"/>
+      <w:r>
+        <w:rPr>
+          <w:rFonts w:eastAsiaTheme="majorEastAsia"/>
+          <w:lang w:val="en-ID"/>
+        </w:rPr>
+        <w:t xml:space="preserve"> </w:t>
+      </w:r>
+      <w:proofErr w:type="spellStart"/>
+      <w:r>
+        <w:rPr>
+          <w:rFonts w:eastAsiaTheme="majorEastAsia"/>
+          <w:lang w:val="en-ID"/>
+        </w:rPr>
+        <w:t>sebagai</w:t>
+      </w:r>
+      <w:proofErr w:type="spellEnd"/>
+      <w:r>
+        <w:rPr>
+          <w:rFonts w:eastAsiaTheme="majorEastAsia"/>
+          <w:lang w:val="en-ID"/>
+        </w:rPr>
+        <w:t xml:space="preserve"> reverse proxy, router </w:t>
+      </w:r>
+      <w:proofErr w:type="spellStart"/>
+      <w:r>
+        <w:rPr>
+          <w:rFonts w:eastAsiaTheme="majorEastAsia"/>
+          <w:lang w:val="en-ID"/>
+        </w:rPr>
+        <w:t>protokol</w:t>
+      </w:r>
+      <w:proofErr w:type="spellEnd"/>
+      <w:r>
+        <w:rPr>
+          <w:rFonts w:eastAsiaTheme="majorEastAsia"/>
+          <w:lang w:val="en-ID"/>
+        </w:rPr>
+        <w:t xml:space="preserve"> HTTP (Port 80 </w:t>
+      </w:r>
+      <w:proofErr w:type="spellStart"/>
+      <w:r>
+        <w:rPr>
+          <w:rFonts w:eastAsiaTheme="majorEastAsia"/>
+          <w:lang w:val="en-ID"/>
+        </w:rPr>
+        <w:t>publik</w:t>
+      </w:r>
+      <w:proofErr w:type="spellEnd"/>
+      <w:r>
+        <w:rPr>
+          <w:rFonts w:eastAsiaTheme="majorEastAsia"/>
+          <w:lang w:val="en-ID"/>
+        </w:rPr>
+        <w:t xml:space="preserve">), </w:t>
+      </w:r>
+      <w:proofErr w:type="spellStart"/>
+      <w:r>
+        <w:rPr>
+          <w:rFonts w:eastAsiaTheme="majorEastAsia"/>
+          <w:lang w:val="en-ID"/>
+        </w:rPr>
+        <w:t>penegak</w:t>
+      </w:r>
+      <w:proofErr w:type="spellEnd"/>
+      <w:r>
+        <w:rPr>
+          <w:rFonts w:eastAsiaTheme="majorEastAsia"/>
+          <w:lang w:val="en-ID"/>
+        </w:rPr>
+        <w:t xml:space="preserve"> </w:t>
+      </w:r>
+      <w:proofErr w:type="spellStart"/>
+      <w:r>
+        <w:rPr>
+          <w:rFonts w:eastAsiaTheme="majorEastAsia"/>
+          <w:lang w:val="en-ID"/>
+        </w:rPr>
+        <w:t>kebijakan</w:t>
+      </w:r>
+      <w:proofErr w:type="spellEnd"/>
+      <w:r>
+        <w:rPr>
+          <w:rFonts w:eastAsiaTheme="majorEastAsia"/>
+          <w:lang w:val="en-ID"/>
+        </w:rPr>
+        <w:t xml:space="preserve"> rate limiting, dan </w:t>
+      </w:r>
+      <w:proofErr w:type="spellStart"/>
+      <w:r>
+        <w:rPr>
+          <w:rFonts w:eastAsiaTheme="majorEastAsia"/>
+          <w:lang w:val="en-ID"/>
+        </w:rPr>
+        <w:t>pemutus</w:t>
+      </w:r>
+      <w:proofErr w:type="spellEnd"/>
+      <w:r>
+        <w:rPr>
+          <w:rFonts w:eastAsiaTheme="majorEastAsia"/>
+          <w:lang w:val="en-ID"/>
+        </w:rPr>
+        <w:t xml:space="preserve"> </w:t>
+      </w:r>
+      <w:proofErr w:type="spellStart"/>
+      <w:r>
+        <w:rPr>
+          <w:rFonts w:eastAsiaTheme="majorEastAsia"/>
+          <w:lang w:val="en-ID"/>
+        </w:rPr>
+        <w:t>sirkuit</w:t>
+      </w:r>
+      <w:proofErr w:type="spellEnd"/>
+      <w:r>
+        <w:rPr>
+          <w:rFonts w:eastAsiaTheme="majorEastAsia"/>
+          <w:lang w:val="en-ID"/>
+        </w:rPr>
+        <w:t xml:space="preserve"> (</w:t>
       </w:r>
       <w:r>
         <w:rPr>
@@ -1090,7 +1218,103 @@
           <w:rFonts w:eastAsiaTheme="majorEastAsia"/>
           <w:lang w:val="en-ID"/>
         </w:rPr>
-        <w:t xml:space="preserve"> (Redis): Penyimpan status dan pencatatan counter request secara real-time untuk mendistribusikan kuota API.</w:t>
+        <w:t xml:space="preserve"> (Redis): </w:t>
+      </w:r>
+      <w:proofErr w:type="spellStart"/>
+      <w:r>
+        <w:rPr>
+          <w:rFonts w:eastAsiaTheme="majorEastAsia"/>
+          <w:lang w:val="en-ID"/>
+        </w:rPr>
+        <w:t>Penyimpan</w:t>
+      </w:r>
+      <w:proofErr w:type="spellEnd"/>
+      <w:r>
+        <w:rPr>
+          <w:rFonts w:eastAsiaTheme="majorEastAsia"/>
+          <w:lang w:val="en-ID"/>
+        </w:rPr>
+        <w:t xml:space="preserve"> status dan </w:t>
+      </w:r>
+      <w:proofErr w:type="spellStart"/>
+      <w:r>
+        <w:rPr>
+          <w:rFonts w:eastAsiaTheme="majorEastAsia"/>
+          <w:lang w:val="en-ID"/>
+        </w:rPr>
+        <w:t>pencatatan</w:t>
+      </w:r>
+      <w:proofErr w:type="spellEnd"/>
+      <w:r>
+        <w:rPr>
+          <w:rFonts w:eastAsiaTheme="majorEastAsia"/>
+          <w:lang w:val="en-ID"/>
+        </w:rPr>
+        <w:t xml:space="preserve"> counter request </w:t>
+      </w:r>
+      <w:proofErr w:type="spellStart"/>
+      <w:r>
+        <w:rPr>
+          <w:rFonts w:eastAsiaTheme="majorEastAsia"/>
+          <w:lang w:val="en-ID"/>
+        </w:rPr>
+        <w:t>secara</w:t>
+      </w:r>
+      <w:proofErr w:type="spellEnd"/>
+      <w:r>
+        <w:rPr>
+          <w:rFonts w:eastAsiaTheme="majorEastAsia"/>
+          <w:lang w:val="en-ID"/>
+        </w:rPr>
+        <w:t xml:space="preserve"> real-time </w:t>
+      </w:r>
+      <w:proofErr w:type="spellStart"/>
+      <w:r>
+        <w:rPr>
+          <w:rFonts w:eastAsiaTheme="majorEastAsia"/>
+          <w:lang w:val="en-ID"/>
+        </w:rPr>
+        <w:t>untuk</w:t>
+      </w:r>
+      <w:proofErr w:type="spellEnd"/>
+      <w:r>
+        <w:rPr>
+          <w:rFonts w:eastAsiaTheme="majorEastAsia"/>
+          <w:lang w:val="en-ID"/>
+        </w:rPr>
+        <w:t xml:space="preserve"> </w:t>
+      </w:r>
+      <w:proofErr w:type="spellStart"/>
+      <w:r>
+        <w:rPr>
+          <w:rFonts w:eastAsiaTheme="majorEastAsia"/>
+          <w:lang w:val="en-ID"/>
+        </w:rPr>
+        <w:t>mendistribusikan</w:t>
+      </w:r>
+      <w:proofErr w:type="spellEnd"/>
+      <w:r>
+        <w:rPr>
+          <w:rFonts w:eastAsiaTheme="majorEastAsia"/>
+          <w:lang w:val="en-ID"/>
+        </w:rPr>
+        <w:t xml:space="preserve"> </w:t>
+      </w:r>
+      <w:proofErr w:type="spellStart"/>
+      <w:r>
+        <w:rPr>
+          <w:rFonts w:eastAsiaTheme="majorEastAsia"/>
+          <w:lang w:val="en-ID"/>
+        </w:rPr>
+        <w:t>kuota</w:t>
+      </w:r>
+      <w:proofErr w:type="spellEnd"/>
+      <w:r>
+        <w:rPr>
+          <w:rFonts w:eastAsiaTheme="majorEastAsia"/>
+          <w:lang w:val="en-ID"/>
+        </w:rPr>
+        <w:t xml:space="preserve"> API.</w:t>
       </w:r>
     </w:p>
     <w:p>
@@ -1110,7 +1334,23 @@
           <w:rFonts w:eastAsiaTheme="majorEastAsia"/>
           <w:lang w:val="en-ID"/>
         </w:rPr>
-        <w:t>Service Kependudukan (</w:t>
+        <w:t xml:space="preserve">Service </w:t>
+      </w:r>
+      <w:proofErr w:type="spellStart"/>
+      <w:r>
+        <w:rPr>
+          <w:rFonts w:eastAsiaTheme="majorEastAsia"/>
+          <w:lang w:val="en-ID"/>
+        </w:rPr>
+        <w:t>Kependudukan</w:t>
+      </w:r>
+      <w:proofErr w:type="spellEnd"/>
+      <w:r>
+        <w:rPr>
+          <w:rFonts w:eastAsiaTheme="majorEastAsia"/>
+          <w:lang w:val="en-ID"/>
+        </w:rPr>
+        <w:t xml:space="preserve"> (</w:t>
       </w:r>
       <w:r>
         <w:rPr>
@@ -1126,7 +1366,119 @@
           <w:rFonts w:eastAsiaTheme="majorEastAsia"/>
           <w:lang w:val="en-ID"/>
         </w:rPr>
-        <w:t>): Layanan pencatatan sipil warga negara dengan delay buatan 50 ms.</w:t>
+        <w:t xml:space="preserve">): </w:t>
+      </w:r>
+      <w:proofErr w:type="spellStart"/>
+      <w:r>
+        <w:rPr>
+          <w:rFonts w:eastAsiaTheme="majorEastAsia"/>
+          <w:lang w:val="en-ID"/>
+        </w:rPr>
+        <w:t>Layanan</w:t>
+      </w:r>
+      <w:proofErr w:type="spellEnd"/>
+      <w:r>
+        <w:rPr>
+          <w:rFonts w:eastAsiaTheme="majorEastAsia"/>
+          <w:lang w:val="en-ID"/>
+        </w:rPr>
+        <w:t xml:space="preserve"> </w:t>
+      </w:r>
+      <w:proofErr w:type="spellStart"/>
+      <w:r>
+        <w:rPr>
+          <w:rFonts w:eastAsiaTheme="majorEastAsia"/>
+          <w:lang w:val="en-ID"/>
+        </w:rPr>
+        <w:t>pencatatan</w:t>
+      </w:r>
+      <w:proofErr w:type="spellEnd"/>
+      <w:r>
+        <w:rPr>
+          <w:rFonts w:eastAsiaTheme="majorEastAsia"/>
+          <w:lang w:val="en-ID"/>
+        </w:rPr>
+        <w:t xml:space="preserve"> </w:t>
+      </w:r>
+      <w:proofErr w:type="spellStart"/>
+      <w:r>
+        <w:rPr>
+          <w:rFonts w:eastAsiaTheme="majorEastAsia"/>
+          <w:lang w:val="en-ID"/>
+        </w:rPr>
+        <w:t>sipil</w:t>
+      </w:r>
+      <w:proofErr w:type="spellEnd"/>
+      <w:r>
+        <w:rPr>
+          <w:rFonts w:eastAsiaTheme="majorEastAsia"/>
+          <w:lang w:val="en-ID"/>
+        </w:rPr>
+        <w:t xml:space="preserve"> </w:t>
+      </w:r>
+      <w:proofErr w:type="spellStart"/>
+      <w:r>
+        <w:rPr>
+          <w:rFonts w:eastAsiaTheme="majorEastAsia"/>
+          <w:lang w:val="en-ID"/>
+        </w:rPr>
+        <w:t>warga</w:t>
+      </w:r>
+      <w:proofErr w:type="spellEnd"/>
+      <w:r>
+        <w:rPr>
+          <w:rFonts w:eastAsiaTheme="majorEastAsia"/>
+          <w:lang w:val="en-ID"/>
+        </w:rPr>
+        <w:t xml:space="preserve"> negara </w:t>
+      </w:r>
+      <w:proofErr w:type="spellStart"/>
+      <w:r>
+        <w:rPr>
+          <w:rFonts w:eastAsiaTheme="majorEastAsia"/>
+          <w:lang w:val="en-ID"/>
+        </w:rPr>
+        <w:t>dengan</w:t>
+      </w:r>
+      <w:proofErr w:type="spellEnd"/>
+      <w:r>
+        <w:rPr>
+          <w:rFonts w:eastAsiaTheme="majorEastAsia"/>
+          <w:lang w:val="en-ID"/>
+        </w:rPr>
+        <w:t xml:space="preserve"> delay </w:t>
+      </w:r>
+      <w:proofErr w:type="spellStart"/>
+      <w:r>
+        <w:rPr>
+          <w:rFonts w:eastAsiaTheme="majorEastAsia"/>
+          <w:lang w:val="en-ID"/>
+        </w:rPr>
+        <w:t>buatan</w:t>
+      </w:r>
+      <w:proofErr w:type="spellEnd"/>
+      <w:r>
+        <w:rPr>
+          <w:rFonts w:eastAsiaTheme="majorEastAsia"/>
+          <w:lang w:val="en-ID"/>
+        </w:rPr>
+        <w:t xml:space="preserve"> 50 </w:t>
+      </w:r>
+      <w:proofErr w:type="spellStart"/>
+      <w:r>
+        <w:rPr>
+          <w:rFonts w:eastAsiaTheme="majorEastAsia"/>
+          <w:lang w:val="en-ID"/>
+        </w:rPr>
+        <w:t>ms</w:t>
+      </w:r>
+      <w:proofErr w:type="spellEnd"/>
+      <w:r>
+        <w:rPr>
+          <w:rFonts w:eastAsiaTheme="majorEastAsia"/>
+          <w:lang w:val="en-ID"/>
+        </w:rPr>
+        <w:t>.</w:t>
       </w:r>
     </w:p>
     <w:p>
@@ -1162,7 +1514,119 @@
           <w:rFonts w:eastAsiaTheme="majorEastAsia"/>
           <w:lang w:val="en-ID"/>
         </w:rPr>
-        <w:t>): Layanan pembayaran PBB dan retribusi daerah dengan delay buatan 100 ms.</w:t>
+        <w:t xml:space="preserve">): </w:t>
+      </w:r>
+      <w:proofErr w:type="spellStart"/>
+      <w:r>
+        <w:rPr>
+          <w:rFonts w:eastAsiaTheme="majorEastAsia"/>
+          <w:lang w:val="en-ID"/>
+        </w:rPr>
+        <w:t>Layanan</w:t>
+      </w:r>
+      <w:proofErr w:type="spellEnd"/>
+      <w:r>
+        <w:rPr>
+          <w:rFonts w:eastAsiaTheme="majorEastAsia"/>
+          <w:lang w:val="en-ID"/>
+        </w:rPr>
+        <w:t xml:space="preserve"> </w:t>
+      </w:r>
+      <w:proofErr w:type="spellStart"/>
+      <w:r>
+        <w:rPr>
+          <w:rFonts w:eastAsiaTheme="majorEastAsia"/>
+          <w:lang w:val="en-ID"/>
+        </w:rPr>
+        <w:t>pembayaran</w:t>
+      </w:r>
+      <w:proofErr w:type="spellEnd"/>
+      <w:r>
+        <w:rPr>
+          <w:rFonts w:eastAsiaTheme="majorEastAsia"/>
+          <w:lang w:val="en-ID"/>
+        </w:rPr>
+        <w:t xml:space="preserve"> PBB dan </w:t>
+      </w:r>
+      <w:proofErr w:type="spellStart"/>
+      <w:r>
+        <w:rPr>
+          <w:rFonts w:eastAsiaTheme="majorEastAsia"/>
+          <w:lang w:val="en-ID"/>
+        </w:rPr>
+        <w:t>retribusi</w:t>
+      </w:r>
+      <w:proofErr w:type="spellEnd"/>
+      <w:r>
+        <w:rPr>
+          <w:rFonts w:eastAsiaTheme="majorEastAsia"/>
+          <w:lang w:val="en-ID"/>
+        </w:rPr>
+        <w:t xml:space="preserve"> </w:t>
+      </w:r>
+      <w:proofErr w:type="spellStart"/>
+      <w:r>
+        <w:rPr>
+          <w:rFonts w:eastAsiaTheme="majorEastAsia"/>
+          <w:lang w:val="en-ID"/>
+        </w:rPr>
+        <w:t>daerah</w:t>
+      </w:r>
+      <w:proofErr w:type="spellEnd"/>
+      <w:r>
+        <w:rPr>
+          <w:rFonts w:eastAsiaTheme="majorEastAsia"/>
+          <w:lang w:val="en-ID"/>
+        </w:rPr>
+        <w:t xml:space="preserve"> </w:t>
+      </w:r>
+      <w:proofErr w:type="spellStart"/>
+      <w:r>
+        <w:rPr>
+          <w:rFonts w:eastAsiaTheme="majorEastAsia"/>
+          <w:lang w:val="en-ID"/>
+        </w:rPr>
+        <w:t>dengan</w:t>
+      </w:r>
+      <w:proofErr w:type="spellEnd"/>
+      <w:r>
+        <w:rPr>
+          <w:rFonts w:eastAsiaTheme="majorEastAsia"/>
+          <w:lang w:val="en-ID"/>
+        </w:rPr>
+        <w:t xml:space="preserve"> delay </w:t>
+      </w:r>
+      <w:proofErr w:type="spellStart"/>
+      <w:r>
+        <w:rPr>
+          <w:rFonts w:eastAsiaTheme="majorEastAsia"/>
+          <w:lang w:val="en-ID"/>
+        </w:rPr>
+        <w:t>buatan</w:t>
+      </w:r>
+      <w:proofErr w:type="spellEnd"/>
+      <w:r>
+        <w:rPr>
+          <w:rFonts w:eastAsiaTheme="majorEastAsia"/>
+          <w:lang w:val="en-ID"/>
+        </w:rPr>
+        <w:t xml:space="preserve"> 100 </w:t>
+      </w:r>
+      <w:proofErr w:type="spellStart"/>
+      <w:r>
+        <w:rPr>
+          <w:rFonts w:eastAsiaTheme="majorEastAsia"/>
+          <w:lang w:val="en-ID"/>
+        </w:rPr>
+        <w:t>ms</w:t>
+      </w:r>
+      <w:proofErr w:type="spellEnd"/>
+      <w:r>
+        <w:rPr>
+          <w:rFonts w:eastAsiaTheme="majorEastAsia"/>
+          <w:lang w:val="en-ID"/>
+        </w:rPr>
+        <w:t>.</w:t>
       </w:r>
     </w:p>
     <w:p>
@@ -1176,14 +1640,37 @@
         <w:rPr>
           <w:lang w:val="en-ID"/>
         </w:rPr>
+        <w:lastRenderedPageBreak/>
         <w:t xml:space="preserve">2.2 </w:t>
       </w:r>
       <w:r>
         <w:rPr>
           <w:lang w:val="en-ID"/>
         </w:rPr>
-        <w:t>Diagram Arsitektur Sistem</w:t>
-      </w:r>
+        <w:t xml:space="preserve">Diagram </w:t>
+      </w:r>
+      <w:proofErr w:type="spellStart"/>
+      <w:r>
+        <w:rPr>
+          <w:lang w:val="en-ID"/>
+        </w:rPr>
+        <w:t>Arsitektur</w:t>
+      </w:r>
+      <w:proofErr w:type="spellEnd"/>
+      <w:r>
+        <w:rPr>
+          <w:lang w:val="en-ID"/>
+        </w:rPr>
+        <w:t xml:space="preserve"> </w:t>
+      </w:r>
+      <w:proofErr w:type="spellStart"/>
+      <w:r>
+        <w:rPr>
+          <w:lang w:val="en-ID"/>
+        </w:rPr>
+        <w:t>Sistem</w:t>
+      </w:r>
+      <w:proofErr w:type="spellEnd"/>
     </w:p>
     <w:p>
       <w:pPr>
@@ -1195,13 +1682,14 @@
       </w:pPr>
       <w:r>
         <w:rPr>
-          <w:noProof/>
+          <w:rFonts w:eastAsiaTheme="majorEastAsia"/>
+          <w:lang w:val="en-ID"/>
         </w:rPr>
         <w:drawing>
-          <wp:inline distT="0" distB="0" distL="0" distR="0" wp14:anchorId="3A0677E3" wp14:editId="5A3BAD24">
-            <wp:extent cx="3451100" cy="3789322"/>
-            <wp:effectExtent l="0" t="0" r="0" b="1905"/>
-            <wp:docPr id="1602658086" name="Picture 1"/>
+          <wp:inline distT="0" distB="0" distL="0" distR="0" wp14:anchorId="6FAE25EB" wp14:editId="6666D28A">
+            <wp:extent cx="3665913" cy="4215084"/>
+            <wp:effectExtent l="0" t="0" r="0" b="0"/>
+            <wp:docPr id="1537816714" name="Picture 3"/>
             <wp:cNvGraphicFramePr>
               <a:graphicFrameLocks xmlns:a="http://schemas.openxmlformats.org/drawingml/2006/main" noChangeAspect="1"/>
             </wp:cNvGraphicFramePr>
@@ -1209,12 +1697,12 @@
               <a:graphicData uri="http://schemas.openxmlformats.org/drawingml/2006/picture">
                 <pic:pic xmlns:pic="http://schemas.openxmlformats.org/drawingml/2006/picture">
                   <pic:nvPicPr>
-                    <pic:cNvPr id="0" name="Picture 1"/>
+                    <pic:cNvPr id="0" name="Picture 11"/>
                     <pic:cNvPicPr>
                       <a:picLocks noChangeAspect="1" noChangeArrowheads="1"/>
                     </pic:cNvPicPr>
                   </pic:nvPicPr>
-                  <pic:blipFill rotWithShape="1">
+                  <pic:blipFill>
                     <a:blip r:embed="rId9" cstate="print">
                       <a:extLst>
                         <a:ext uri="{28A0092B-C50C-407E-A947-70E740481C1C}">
@@ -1222,7 +1710,7 @@
                         </a:ext>
                       </a:extLst>
                     </a:blip>
-                    <a:srcRect l="7963" t="5512" r="7657" b="1839"/>
+                    <a:srcRect/>
                     <a:stretch>
                       <a:fillRect/>
                     </a:stretch>
@@ -1230,7 +1718,7 @@
                   <pic:spPr bwMode="auto">
                     <a:xfrm>
                       <a:off x="0" y="0"/>
-                      <a:ext cx="3465670" cy="3805320"/>
+                      <a:ext cx="3675605" cy="4226228"/>
                     </a:xfrm>
                     <a:prstGeom prst="rect">
                       <a:avLst/>
@@ -1239,11 +1727,6 @@
                     <a:ln>
                       <a:noFill/>
                     </a:ln>
-                    <a:extLst>
-                      <a:ext uri="{53640926-AAD7-44D8-BBD7-CCE9431645EC}">
-                        <a14:shadowObscured xmlns:a14="http://schemas.microsoft.com/office/drawing/2010/main"/>
-                      </a:ext>
-                    </a:extLst>
                   </pic:spPr>
                 </pic:pic>
               </a:graphicData>
@@ -1254,6 +1737,15 @@
     </w:p>
     <w:p>
       <w:pPr>
+        <w:jc w:val="center"/>
+        <w:rPr>
+          <w:rFonts w:eastAsiaTheme="majorEastAsia"/>
+          <w:lang w:val="en-ID"/>
+        </w:rPr>
+      </w:pPr>
+    </w:p>
+    <w:p>
+      <w:pPr>
         <w:pStyle w:val="Heading2"/>
         <w:rPr>
           <w:lang w:val="en-ID"/>
@@ -1263,14 +1755,41 @@
         <w:rPr>
           <w:lang w:val="en-ID"/>
         </w:rPr>
-        <w:lastRenderedPageBreak/>
         <w:t xml:space="preserve">2.3 </w:t>
       </w:r>
       <w:r>
         <w:rPr>
           <w:lang w:val="en-ID"/>
         </w:rPr>
-        <w:t>Alur Kerja Permintaan (</w:t>
+        <w:t xml:space="preserve">Alur </w:t>
+      </w:r>
+      <w:proofErr w:type="spellStart"/>
+      <w:r>
+        <w:rPr>
+          <w:lang w:val="en-ID"/>
+        </w:rPr>
+        <w:t>Kerja</w:t>
+      </w:r>
+      <w:proofErr w:type="spellEnd"/>
+      <w:r>
+        <w:rPr>
+          <w:lang w:val="en-ID"/>
+        </w:rPr>
+        <w:t xml:space="preserve"> </w:t>
+      </w:r>
+      <w:proofErr w:type="spellStart"/>
+      <w:r>
+        <w:rPr>
+          <w:lang w:val="en-ID"/>
+        </w:rPr>
+        <w:t>Permintaan</w:t>
+      </w:r>
+      <w:proofErr w:type="spellEnd"/>
+      <w:r>
+        <w:rPr>
+          <w:lang w:val="en-ID"/>
+        </w:rPr>
+        <w:t xml:space="preserve"> (</w:t>
       </w:r>
       <w:r>
         <w:rPr>
@@ -1304,7 +1823,55 @@
           <w:rFonts w:eastAsiaTheme="majorEastAsia"/>
           <w:lang w:val="en-ID"/>
         </w:rPr>
-        <w:t>Klien (Warga / Skrip Penguji K6) mengirimkan HTTP Request ke http://localhost/api/v1/... pada Port 80.</w:t>
+        <w:t xml:space="preserve">Klien (Warga / Skrip </w:t>
+      </w:r>
+      <w:proofErr w:type="spellStart"/>
+      <w:r>
+        <w:rPr>
+          <w:rFonts w:eastAsiaTheme="majorEastAsia"/>
+          <w:lang w:val="en-ID"/>
+        </w:rPr>
+        <w:t>Penguji</w:t>
+      </w:r>
+      <w:proofErr w:type="spellEnd"/>
+      <w:r>
+        <w:rPr>
+          <w:rFonts w:eastAsiaTheme="majorEastAsia"/>
+          <w:lang w:val="en-ID"/>
+        </w:rPr>
+        <w:t xml:space="preserve"> K6) </w:t>
+      </w:r>
+      <w:proofErr w:type="spellStart"/>
+      <w:r>
+        <w:rPr>
+          <w:rFonts w:eastAsiaTheme="majorEastAsia"/>
+          <w:lang w:val="en-ID"/>
+        </w:rPr>
+        <w:t>mengirimkan</w:t>
+      </w:r>
+      <w:proofErr w:type="spellEnd"/>
+      <w:r>
+        <w:rPr>
+          <w:rFonts w:eastAsiaTheme="majorEastAsia"/>
+          <w:lang w:val="en-ID"/>
+        </w:rPr>
+        <w:t xml:space="preserve"> HTTP Request </w:t>
+      </w:r>
+      <w:proofErr w:type="spellStart"/>
+      <w:r>
+        <w:rPr>
+          <w:rFonts w:eastAsiaTheme="majorEastAsia"/>
+          <w:lang w:val="en-ID"/>
+        </w:rPr>
+        <w:t>ke</w:t>
+      </w:r>
+      <w:proofErr w:type="spellEnd"/>
+      <w:r>
+        <w:rPr>
+          <w:rFonts w:eastAsiaTheme="majorEastAsia"/>
+          <w:lang w:val="en-ID"/>
+        </w:rPr>
+        <w:t xml:space="preserve"> http://localhost/api/v1/... pada Port 80.</w:t>
       </w:r>
     </w:p>
     <w:p>
@@ -1324,7 +1891,103 @@
           <w:rFonts w:eastAsiaTheme="majorEastAsia"/>
           <w:lang w:val="en-ID"/>
         </w:rPr>
-        <w:t>Kong Gateway menangkap request dan melakukan inspeksi kuota IP klien ke container Redis (redis:6379).</w:t>
+        <w:t xml:space="preserve">Kong Gateway </w:t>
+      </w:r>
+      <w:proofErr w:type="spellStart"/>
+      <w:r>
+        <w:rPr>
+          <w:rFonts w:eastAsiaTheme="majorEastAsia"/>
+          <w:lang w:val="en-ID"/>
+        </w:rPr>
+        <w:t>menangkap</w:t>
+      </w:r>
+      <w:proofErr w:type="spellEnd"/>
+      <w:r>
+        <w:rPr>
+          <w:rFonts w:eastAsiaTheme="majorEastAsia"/>
+          <w:lang w:val="en-ID"/>
+        </w:rPr>
+        <w:t xml:space="preserve"> request dan </w:t>
+      </w:r>
+      <w:proofErr w:type="spellStart"/>
+      <w:r>
+        <w:rPr>
+          <w:rFonts w:eastAsiaTheme="majorEastAsia"/>
+          <w:lang w:val="en-ID"/>
+        </w:rPr>
+        <w:t>melakukan</w:t>
+      </w:r>
+      <w:proofErr w:type="spellEnd"/>
+      <w:r>
+        <w:rPr>
+          <w:rFonts w:eastAsiaTheme="majorEastAsia"/>
+          <w:lang w:val="en-ID"/>
+        </w:rPr>
+        <w:t xml:space="preserve"> </w:t>
+      </w:r>
+      <w:proofErr w:type="spellStart"/>
+      <w:r>
+        <w:rPr>
+          <w:rFonts w:eastAsiaTheme="majorEastAsia"/>
+          <w:lang w:val="en-ID"/>
+        </w:rPr>
+        <w:t>inspeksi</w:t>
+      </w:r>
+      <w:proofErr w:type="spellEnd"/>
+      <w:r>
+        <w:rPr>
+          <w:rFonts w:eastAsiaTheme="majorEastAsia"/>
+          <w:lang w:val="en-ID"/>
+        </w:rPr>
+        <w:t xml:space="preserve"> </w:t>
+      </w:r>
+      <w:proofErr w:type="spellStart"/>
+      <w:r>
+        <w:rPr>
+          <w:rFonts w:eastAsiaTheme="majorEastAsia"/>
+          <w:lang w:val="en-ID"/>
+        </w:rPr>
+        <w:t>kuota</w:t>
+      </w:r>
+      <w:proofErr w:type="spellEnd"/>
+      <w:r>
+        <w:rPr>
+          <w:rFonts w:eastAsiaTheme="majorEastAsia"/>
+          <w:lang w:val="en-ID"/>
+        </w:rPr>
+        <w:t xml:space="preserve"> IP </w:t>
+      </w:r>
+      <w:proofErr w:type="spellStart"/>
+      <w:r>
+        <w:rPr>
+          <w:rFonts w:eastAsiaTheme="majorEastAsia"/>
+          <w:lang w:val="en-ID"/>
+        </w:rPr>
+        <w:t>klien</w:t>
+      </w:r>
+      <w:proofErr w:type="spellEnd"/>
+      <w:r>
+        <w:rPr>
+          <w:rFonts w:eastAsiaTheme="majorEastAsia"/>
+          <w:lang w:val="en-ID"/>
+        </w:rPr>
+        <w:t xml:space="preserve"> </w:t>
+      </w:r>
+      <w:proofErr w:type="spellStart"/>
+      <w:r>
+        <w:rPr>
+          <w:rFonts w:eastAsiaTheme="majorEastAsia"/>
+          <w:lang w:val="en-ID"/>
+        </w:rPr>
+        <w:t>ke</w:t>
+      </w:r>
+      <w:proofErr w:type="spellEnd"/>
+      <w:r>
+        <w:rPr>
+          <w:rFonts w:eastAsiaTheme="majorEastAsia"/>
+          <w:lang w:val="en-ID"/>
+        </w:rPr>
+        <w:t xml:space="preserve"> container Redis (redis:6379).</w:t>
       </w:r>
     </w:p>
     <w:p>
@@ -1344,7 +2007,87 @@
           <w:rFonts w:eastAsiaTheme="majorEastAsia"/>
           <w:lang w:val="en-ID"/>
         </w:rPr>
-        <w:t>Jika kuota mencukupi, Gateway meneruskan request ke microservice yang sesuai via DNS Docker internal.</w:t>
+        <w:t xml:space="preserve">Jika </w:t>
+      </w:r>
+      <w:proofErr w:type="spellStart"/>
+      <w:r>
+        <w:rPr>
+          <w:rFonts w:eastAsiaTheme="majorEastAsia"/>
+          <w:lang w:val="en-ID"/>
+        </w:rPr>
+        <w:t>kuota</w:t>
+      </w:r>
+      <w:proofErr w:type="spellEnd"/>
+      <w:r>
+        <w:rPr>
+          <w:rFonts w:eastAsiaTheme="majorEastAsia"/>
+          <w:lang w:val="en-ID"/>
+        </w:rPr>
+        <w:t xml:space="preserve"> </w:t>
+      </w:r>
+      <w:proofErr w:type="spellStart"/>
+      <w:r>
+        <w:rPr>
+          <w:rFonts w:eastAsiaTheme="majorEastAsia"/>
+          <w:lang w:val="en-ID"/>
+        </w:rPr>
+        <w:t>mencukupi</w:t>
+      </w:r>
+      <w:proofErr w:type="spellEnd"/>
+      <w:r>
+        <w:rPr>
+          <w:rFonts w:eastAsiaTheme="majorEastAsia"/>
+          <w:lang w:val="en-ID"/>
+        </w:rPr>
+        <w:t xml:space="preserve">, Gateway </w:t>
+      </w:r>
+      <w:proofErr w:type="spellStart"/>
+      <w:r>
+        <w:rPr>
+          <w:rFonts w:eastAsiaTheme="majorEastAsia"/>
+          <w:lang w:val="en-ID"/>
+        </w:rPr>
+        <w:t>meneruskan</w:t>
+      </w:r>
+      <w:proofErr w:type="spellEnd"/>
+      <w:r>
+        <w:rPr>
+          <w:rFonts w:eastAsiaTheme="majorEastAsia"/>
+          <w:lang w:val="en-ID"/>
+        </w:rPr>
+        <w:t xml:space="preserve"> request </w:t>
+      </w:r>
+      <w:proofErr w:type="spellStart"/>
+      <w:r>
+        <w:rPr>
+          <w:rFonts w:eastAsiaTheme="majorEastAsia"/>
+          <w:lang w:val="en-ID"/>
+        </w:rPr>
+        <w:t>ke</w:t>
+      </w:r>
+      <w:proofErr w:type="spellEnd"/>
+      <w:r>
+        <w:rPr>
+          <w:rFonts w:eastAsiaTheme="majorEastAsia"/>
+          <w:lang w:val="en-ID"/>
+        </w:rPr>
+        <w:t xml:space="preserve"> microservice yang </w:t>
+      </w:r>
+      <w:proofErr w:type="spellStart"/>
+      <w:r>
+        <w:rPr>
+          <w:rFonts w:eastAsiaTheme="majorEastAsia"/>
+          <w:lang w:val="en-ID"/>
+        </w:rPr>
+        <w:t>sesuai</w:t>
+      </w:r>
+      <w:proofErr w:type="spellEnd"/>
+      <w:r>
+        <w:rPr>
+          <w:rFonts w:eastAsiaTheme="majorEastAsia"/>
+          <w:lang w:val="en-ID"/>
+        </w:rPr>
+        <w:t xml:space="preserve"> via DNS Docker internal.</w:t>
       </w:r>
     </w:p>
     <w:p>
@@ -1363,7 +2106,119 @@
           <w:rFonts w:eastAsiaTheme="majorEastAsia"/>
           <w:lang w:val="en-ID"/>
         </w:rPr>
-        <w:t>Jika kuota habis, Gateway langsung memotong jalur dan mengembalikan respons HTTP 429 Too Many Requests.</w:t>
+        <w:t xml:space="preserve">Jika </w:t>
+      </w:r>
+      <w:proofErr w:type="spellStart"/>
+      <w:r>
+        <w:rPr>
+          <w:rFonts w:eastAsiaTheme="majorEastAsia"/>
+          <w:lang w:val="en-ID"/>
+        </w:rPr>
+        <w:t>kuota</w:t>
+      </w:r>
+      <w:proofErr w:type="spellEnd"/>
+      <w:r>
+        <w:rPr>
+          <w:rFonts w:eastAsiaTheme="majorEastAsia"/>
+          <w:lang w:val="en-ID"/>
+        </w:rPr>
+        <w:t xml:space="preserve"> </w:t>
+      </w:r>
+      <w:proofErr w:type="spellStart"/>
+      <w:r>
+        <w:rPr>
+          <w:rFonts w:eastAsiaTheme="majorEastAsia"/>
+          <w:lang w:val="en-ID"/>
+        </w:rPr>
+        <w:t>habis</w:t>
+      </w:r>
+      <w:proofErr w:type="spellEnd"/>
+      <w:r>
+        <w:rPr>
+          <w:rFonts w:eastAsiaTheme="majorEastAsia"/>
+          <w:lang w:val="en-ID"/>
+        </w:rPr>
+        <w:t xml:space="preserve">, Gateway </w:t>
+      </w:r>
+      <w:proofErr w:type="spellStart"/>
+      <w:r>
+        <w:rPr>
+          <w:rFonts w:eastAsiaTheme="majorEastAsia"/>
+          <w:lang w:val="en-ID"/>
+        </w:rPr>
+        <w:t>langsung</w:t>
+      </w:r>
+      <w:proofErr w:type="spellEnd"/>
+      <w:r>
+        <w:rPr>
+          <w:rFonts w:eastAsiaTheme="majorEastAsia"/>
+          <w:lang w:val="en-ID"/>
+        </w:rPr>
+        <w:t xml:space="preserve"> </w:t>
+      </w:r>
+      <w:proofErr w:type="spellStart"/>
+      <w:r>
+        <w:rPr>
+          <w:rFonts w:eastAsiaTheme="majorEastAsia"/>
+          <w:lang w:val="en-ID"/>
+        </w:rPr>
+        <w:t>memotong</w:t>
+      </w:r>
+      <w:proofErr w:type="spellEnd"/>
+      <w:r>
+        <w:rPr>
+          <w:rFonts w:eastAsiaTheme="majorEastAsia"/>
+          <w:lang w:val="en-ID"/>
+        </w:rPr>
+        <w:t xml:space="preserve"> </w:t>
+      </w:r>
+      <w:proofErr w:type="spellStart"/>
+      <w:r>
+        <w:rPr>
+          <w:rFonts w:eastAsiaTheme="majorEastAsia"/>
+          <w:lang w:val="en-ID"/>
+        </w:rPr>
+        <w:t>jalur</w:t>
+      </w:r>
+      <w:proofErr w:type="spellEnd"/>
+      <w:r>
+        <w:rPr>
+          <w:rFonts w:eastAsiaTheme="majorEastAsia"/>
+          <w:lang w:val="en-ID"/>
+        </w:rPr>
+        <w:t xml:space="preserve"> dan </w:t>
+      </w:r>
+      <w:proofErr w:type="spellStart"/>
+      <w:r>
+        <w:rPr>
+          <w:rFonts w:eastAsiaTheme="majorEastAsia"/>
+          <w:lang w:val="en-ID"/>
+        </w:rPr>
+        <w:t>mengembalikan</w:t>
+      </w:r>
+      <w:proofErr w:type="spellEnd"/>
+      <w:r>
+        <w:rPr>
+          <w:rFonts w:eastAsiaTheme="majorEastAsia"/>
+          <w:lang w:val="en-ID"/>
+        </w:rPr>
+        <w:t xml:space="preserve"> </w:t>
+      </w:r>
+      <w:proofErr w:type="spellStart"/>
+      <w:r>
+        <w:rPr>
+          <w:rFonts w:eastAsiaTheme="majorEastAsia"/>
+          <w:lang w:val="en-ID"/>
+        </w:rPr>
+        <w:t>respons</w:t>
+      </w:r>
+      <w:proofErr w:type="spellEnd"/>
+      <w:r>
+        <w:rPr>
+          <w:rFonts w:eastAsiaTheme="majorEastAsia"/>
+          <w:lang w:val="en-ID"/>
+        </w:rPr>
+        <w:t xml:space="preserve"> HTTP 429 Too Many Requests.</w:t>
       </w:r>
     </w:p>
     <w:p>
@@ -1385,6 +2240,7 @@
         <w:rPr>
           <w:lang w:val="en-ID"/>
         </w:rPr>
+        <w:lastRenderedPageBreak/>
         <w:t>BAB III</w:t>
       </w:r>
     </w:p>
@@ -1416,7 +2272,49 @@
         <w:rPr>
           <w:lang w:val="en-ID"/>
         </w:rPr>
-        <w:t>3.1 Topologi Jaringan (smartcity-net)</w:t>
+        <w:t xml:space="preserve">3.1 </w:t>
+      </w:r>
+      <w:proofErr w:type="spellStart"/>
+      <w:r>
+        <w:rPr>
+          <w:lang w:val="en-ID"/>
+        </w:rPr>
+        <w:t>Topologi</w:t>
+      </w:r>
+      <w:proofErr w:type="spellEnd"/>
+      <w:r>
+        <w:rPr>
+          <w:lang w:val="en-ID"/>
+        </w:rPr>
+        <w:t xml:space="preserve"> </w:t>
+      </w:r>
+      <w:proofErr w:type="spellStart"/>
+      <w:r>
+        <w:rPr>
+          <w:lang w:val="en-ID"/>
+        </w:rPr>
+        <w:t>Jaringan</w:t>
+      </w:r>
+      <w:proofErr w:type="spellEnd"/>
+      <w:r>
+        <w:rPr>
+          <w:lang w:val="en-ID"/>
+        </w:rPr>
+        <w:t xml:space="preserve"> (</w:t>
+      </w:r>
+      <w:proofErr w:type="spellStart"/>
+      <w:r>
+        <w:rPr>
+          <w:lang w:val="en-ID"/>
+        </w:rPr>
+        <w:t>smartcity</w:t>
+      </w:r>
+      <w:proofErr w:type="spellEnd"/>
+      <w:r>
+        <w:rPr>
+          <w:lang w:val="en-ID"/>
+        </w:rPr>
+        <w:t>-net)</w:t>
       </w:r>
     </w:p>
     <w:p>
@@ -1498,11 +2396,33 @@
         </w:rPr>
         <w:t xml:space="preserve">3.2 </w:t>
       </w:r>
-      <w:r>
-        <w:rPr>
-          <w:lang w:val="en-ID"/>
-        </w:rPr>
-        <w:t>Pemetaan dan Pembatasan Akses Port</w:t>
+      <w:proofErr w:type="spellStart"/>
+      <w:r>
+        <w:rPr>
+          <w:lang w:val="en-ID"/>
+        </w:rPr>
+        <w:t>Pemetaan</w:t>
+      </w:r>
+      <w:proofErr w:type="spellEnd"/>
+      <w:r>
+        <w:rPr>
+          <w:lang w:val="en-ID"/>
+        </w:rPr>
+        <w:t xml:space="preserve"> dan </w:t>
+      </w:r>
+      <w:proofErr w:type="spellStart"/>
+      <w:r>
+        <w:rPr>
+          <w:lang w:val="en-ID"/>
+        </w:rPr>
+        <w:t>Pembatasan</w:t>
+      </w:r>
+      <w:proofErr w:type="spellEnd"/>
+      <w:r>
+        <w:rPr>
+          <w:lang w:val="en-ID"/>
+        </w:rPr>
+        <w:t xml:space="preserve"> Akses Port</w:t>
       </w:r>
     </w:p>
     <w:tbl>
@@ -1512,16 +2432,16 @@
         <w:tblLook w:val="04A0" w:firstRow="1" w:lastRow="0" w:firstColumn="1" w:lastColumn="0" w:noHBand="0" w:noVBand="1"/>
       </w:tblPr>
       <w:tblGrid>
-        <w:gridCol w:w="1558"/>
-        <w:gridCol w:w="1509"/>
-        <w:gridCol w:w="1213"/>
-        <w:gridCol w:w="2002"/>
-        <w:gridCol w:w="1645"/>
+        <w:gridCol w:w="1544"/>
+        <w:gridCol w:w="1568"/>
+        <w:gridCol w:w="1203"/>
+        <w:gridCol w:w="1983"/>
+        <w:gridCol w:w="1629"/>
       </w:tblGrid>
       <w:tr>
         <w:tc>
           <w:tcPr>
-            <w:tcW w:w="1642" w:type="dxa"/>
+            <w:tcW w:w="1544" w:type="dxa"/>
             <w:vAlign w:val="center"/>
           </w:tcPr>
           <w:p>
@@ -1542,7 +2462,7 @@
         </w:tc>
         <w:tc>
           <w:tcPr>
-            <w:tcW w:w="1591" w:type="dxa"/>
+            <w:tcW w:w="1568" w:type="dxa"/>
             <w:vAlign w:val="center"/>
           </w:tcPr>
           <w:p>
@@ -1563,7 +2483,7 @@
         </w:tc>
         <w:tc>
           <w:tcPr>
-            <w:tcW w:w="1724" w:type="dxa"/>
+            <w:tcW w:w="1203" w:type="dxa"/>
             <w:vAlign w:val="center"/>
           </w:tcPr>
           <w:p>
@@ -1584,7 +2504,7 @@
         </w:tc>
         <w:tc>
           <w:tcPr>
-            <w:tcW w:w="1667" w:type="dxa"/>
+            <w:tcW w:w="1983" w:type="dxa"/>
             <w:vAlign w:val="center"/>
           </w:tcPr>
           <w:p>
@@ -1605,7 +2525,7 @@
         </w:tc>
         <w:tc>
           <w:tcPr>
-            <w:tcW w:w="1303" w:type="dxa"/>
+            <w:tcW w:w="1629" w:type="dxa"/>
             <w:vAlign w:val="center"/>
           </w:tcPr>
           <w:p>
@@ -1628,7 +2548,7 @@
       <w:tr>
         <w:tc>
           <w:tcPr>
-            <w:tcW w:w="1642" w:type="dxa"/>
+            <w:tcW w:w="1544" w:type="dxa"/>
           </w:tcPr>
           <w:p>
             <w:pPr>
@@ -1647,7 +2567,7 @@
         </w:tc>
         <w:tc>
           <w:tcPr>
-            <w:tcW w:w="1591" w:type="dxa"/>
+            <w:tcW w:w="1568" w:type="dxa"/>
           </w:tcPr>
           <w:p>
             <w:pPr>
@@ -1666,7 +2586,7 @@
         </w:tc>
         <w:tc>
           <w:tcPr>
-            <w:tcW w:w="1724" w:type="dxa"/>
+            <w:tcW w:w="1203" w:type="dxa"/>
           </w:tcPr>
           <w:p>
             <w:pPr>
@@ -1685,7 +2605,7 @@
         </w:tc>
         <w:tc>
           <w:tcPr>
-            <w:tcW w:w="1667" w:type="dxa"/>
+            <w:tcW w:w="1983" w:type="dxa"/>
           </w:tcPr>
           <w:p>
             <w:pPr>
@@ -1704,7 +2624,7 @@
         </w:tc>
         <w:tc>
           <w:tcPr>
-            <w:tcW w:w="1303" w:type="dxa"/>
+            <w:tcW w:w="1629" w:type="dxa"/>
           </w:tcPr>
           <w:p>
             <w:pPr>
@@ -1725,72 +2645,66 @@
       <w:tr>
         <w:tc>
           <w:tcPr>
-            <w:tcW w:w="1642" w:type="dxa"/>
+            <w:tcW w:w="1544" w:type="dxa"/>
           </w:tcPr>
           <w:p>
             <w:pPr>
               <w:rPr>
                 <w:rFonts w:eastAsiaTheme="majorEastAsia"/>
-                <w:lang w:val="da-DK"/>
               </w:rPr>
             </w:pPr>
             <w:r>
               <w:rPr>
                 <w:rFonts w:eastAsiaTheme="majorEastAsia"/>
               </w:rPr>
-              <w:lastRenderedPageBreak/>
-              <w:t>Redis Store</w:t>
+              <w:t>Redis Primary (Master)</w:t>
             </w:r>
           </w:p>
         </w:tc>
         <w:tc>
           <w:tcPr>
-            <w:tcW w:w="1591" w:type="dxa"/>
+            <w:tcW w:w="1568" w:type="dxa"/>
           </w:tcPr>
           <w:p>
             <w:pPr>
               <w:rPr>
                 <w:rFonts w:eastAsiaTheme="majorEastAsia"/>
-                <w:lang w:val="da-DK"/>
               </w:rPr>
             </w:pPr>
             <w:r>
               <w:rPr>
                 <w:rFonts w:eastAsiaTheme="majorEastAsia"/>
               </w:rPr>
-              <w:t>smartcity-redis</w:t>
+              <w:t>smartcity-redis-primary</w:t>
             </w:r>
           </w:p>
         </w:tc>
         <w:tc>
           <w:tcPr>
-            <w:tcW w:w="1724" w:type="dxa"/>
+            <w:tcW w:w="1203" w:type="dxa"/>
           </w:tcPr>
           <w:p>
             <w:pPr>
               <w:rPr>
                 <w:rFonts w:eastAsiaTheme="majorEastAsia"/>
-                <w:lang w:val="da-DK"/>
               </w:rPr>
             </w:pPr>
             <w:r>
               <w:rPr>
                 <w:rFonts w:eastAsiaTheme="majorEastAsia"/>
-                <w:lang w:val="da-DK"/>
-              </w:rPr>
-              <w:t>6379</w:t>
+              </w:rPr>
+              <w:t>6397</w:t>
             </w:r>
           </w:p>
         </w:tc>
         <w:tc>
           <w:tcPr>
-            <w:tcW w:w="1667" w:type="dxa"/>
+            <w:tcW w:w="1983" w:type="dxa"/>
           </w:tcPr>
           <w:p>
             <w:pPr>
               <w:rPr>
                 <w:rFonts w:eastAsiaTheme="majorEastAsia"/>
-                <w:lang w:val="da-DK"/>
               </w:rPr>
             </w:pPr>
             <w:r>
@@ -1805,20 +2719,33 @@
         </w:tc>
         <w:tc>
           <w:tcPr>
-            <w:tcW w:w="1303" w:type="dxa"/>
+            <w:tcW w:w="1629" w:type="dxa"/>
           </w:tcPr>
           <w:p>
             <w:pPr>
               <w:rPr>
                 <w:rFonts w:eastAsiaTheme="majorEastAsia"/>
-                <w:lang w:val="en-ID"/>
               </w:rPr>
             </w:pPr>
             <w:r>
               <w:rPr>
                 <w:rFonts w:eastAsiaTheme="majorEastAsia"/>
               </w:rPr>
-              <w:t>Terisolasi di jaringan internal, hanya diakses oleh Gateway.</w:t>
+              <w:t>In-memory store kuota rate limiting aktif (</w:t>
+            </w:r>
+            <w:r>
+              <w:rPr>
+                <w:rFonts w:eastAsiaTheme="majorEastAsia"/>
+                <w:i/>
+                <w:iCs/>
+              </w:rPr>
+              <w:t>Single Source of Truth</w:t>
+            </w:r>
+            <w:r>
+              <w:rPr>
+                <w:rFonts w:eastAsiaTheme="majorEastAsia"/>
+              </w:rPr>
+              <w:t>).</w:t>
             </w:r>
           </w:p>
         </w:tc>
@@ -1826,7 +2753,7 @@
       <w:tr>
         <w:tc>
           <w:tcPr>
-            <w:tcW w:w="1642" w:type="dxa"/>
+            <w:tcW w:w="1544" w:type="dxa"/>
           </w:tcPr>
           <w:p>
             <w:pPr>
@@ -1839,13 +2766,13 @@
               <w:rPr>
                 <w:rFonts w:eastAsiaTheme="majorEastAsia"/>
               </w:rPr>
-              <w:t>Service Kependudukan</w:t>
+              <w:t>Redis Replica (Slave)</w:t>
             </w:r>
           </w:p>
         </w:tc>
         <w:tc>
           <w:tcPr>
-            <w:tcW w:w="1591" w:type="dxa"/>
+            <w:tcW w:w="1568" w:type="dxa"/>
           </w:tcPr>
           <w:p>
             <w:pPr>
@@ -1858,13 +2785,13 @@
               <w:rPr>
                 <w:rFonts w:eastAsiaTheme="majorEastAsia"/>
               </w:rPr>
-              <w:t>service-kependudukan</w:t>
+              <w:t>smartcity-redis-replica</w:t>
             </w:r>
           </w:p>
         </w:tc>
         <w:tc>
           <w:tcPr>
-            <w:tcW w:w="1724" w:type="dxa"/>
+            <w:tcW w:w="1203" w:type="dxa"/>
           </w:tcPr>
           <w:p>
             <w:pPr>
@@ -1878,13 +2805,13 @@
                 <w:rFonts w:eastAsiaTheme="majorEastAsia"/>
                 <w:lang w:val="da-DK"/>
               </w:rPr>
-              <w:t>3000</w:t>
+              <w:t>6379</w:t>
             </w:r>
           </w:p>
         </w:tc>
         <w:tc>
           <w:tcPr>
-            <w:tcW w:w="1667" w:type="dxa"/>
+            <w:tcW w:w="1983" w:type="dxa"/>
           </w:tcPr>
           <w:p>
             <w:pPr>
@@ -1905,20 +2832,43 @@
         </w:tc>
         <w:tc>
           <w:tcPr>
-            <w:tcW w:w="1303" w:type="dxa"/>
+            <w:tcW w:w="1629" w:type="dxa"/>
           </w:tcPr>
           <w:p>
             <w:pPr>
               <w:rPr>
                 <w:rFonts w:eastAsiaTheme="majorEastAsia"/>
-                <w:lang w:val="da-DK"/>
+                <w:lang w:val="en-ID"/>
               </w:rPr>
             </w:pPr>
             <w:r>
               <w:rPr>
                 <w:rFonts w:eastAsiaTheme="majorEastAsia"/>
               </w:rPr>
-              <w:t>Terisolasi, tidak dapat diakses langsung oleh klien eksternal.</w:t>
+              <w:t xml:space="preserve">Cadangan data kuota sekunder melalui </w:t>
+            </w:r>
+            <w:r>
+              <w:rPr>
+                <w:rFonts w:eastAsiaTheme="majorEastAsia"/>
+                <w:i/>
+                <w:iCs/>
+              </w:rPr>
+              <w:t xml:space="preserve">Continuous </w:t>
+            </w:r>
+            <w:r>
+              <w:rPr>
+                <w:rFonts w:eastAsiaTheme="majorEastAsia"/>
+                <w:i/>
+                <w:iCs/>
+              </w:rPr>
+              <w:lastRenderedPageBreak/>
+              <w:t>Asynchronous Replication</w:t>
+            </w:r>
+            <w:r>
+              <w:rPr>
+                <w:rFonts w:eastAsiaTheme="majorEastAsia"/>
+              </w:rPr>
+              <w:t xml:space="preserve"> dari Master.</w:t>
             </w:r>
           </w:p>
         </w:tc>
@@ -1926,7 +2876,7 @@
       <w:tr>
         <w:tc>
           <w:tcPr>
-            <w:tcW w:w="1642" w:type="dxa"/>
+            <w:tcW w:w="1544" w:type="dxa"/>
           </w:tcPr>
           <w:p>
             <w:pPr>
@@ -1939,13 +2889,14 @@
               <w:rPr>
                 <w:rFonts w:eastAsiaTheme="majorEastAsia"/>
               </w:rPr>
-              <w:t>Service Pajak</w:t>
+              <w:lastRenderedPageBreak/>
+              <w:t>Service Kependudukan (Node 1)</w:t>
             </w:r>
           </w:p>
         </w:tc>
         <w:tc>
           <w:tcPr>
-            <w:tcW w:w="1591" w:type="dxa"/>
+            <w:tcW w:w="1568" w:type="dxa"/>
           </w:tcPr>
           <w:p>
             <w:pPr>
@@ -1958,13 +2909,13 @@
               <w:rPr>
                 <w:rFonts w:eastAsiaTheme="majorEastAsia"/>
               </w:rPr>
-              <w:t>service-pajak</w:t>
+              <w:t>service-kependudukan-1</w:t>
             </w:r>
           </w:p>
         </w:tc>
         <w:tc>
           <w:tcPr>
-            <w:tcW w:w="1724" w:type="dxa"/>
+            <w:tcW w:w="1203" w:type="dxa"/>
           </w:tcPr>
           <w:p>
             <w:pPr>
@@ -1984,7 +2935,7 @@
         </w:tc>
         <w:tc>
           <w:tcPr>
-            <w:tcW w:w="1667" w:type="dxa"/>
+            <w:tcW w:w="1983" w:type="dxa"/>
           </w:tcPr>
           <w:p>
             <w:pPr>
@@ -2005,7 +2956,7 @@
         </w:tc>
         <w:tc>
           <w:tcPr>
-            <w:tcW w:w="1303" w:type="dxa"/>
+            <w:tcW w:w="1629" w:type="dxa"/>
           </w:tcPr>
           <w:p>
             <w:pPr>
@@ -2017,9 +2968,369 @@
             <w:r>
               <w:rPr>
                 <w:rFonts w:eastAsiaTheme="majorEastAsia"/>
+              </w:rPr>
+              <w:t>Mock API Kependudukan (Delay 50ms), melayani trafik rotasi dari Load Balancer.</w:t>
+            </w:r>
+          </w:p>
+        </w:tc>
+      </w:tr>
+      <w:tr>
+        <w:tc>
+          <w:tcPr>
+            <w:tcW w:w="1544" w:type="dxa"/>
+          </w:tcPr>
+          <w:p>
+            <w:pPr>
+              <w:rPr>
+                <w:rFonts w:eastAsiaTheme="majorEastAsia"/>
                 <w:lang w:val="da-DK"/>
               </w:rPr>
-              <w:t>Terisolasi, tidak dapat diakses langsung oleh klien eksternal.</w:t>
+            </w:pPr>
+            <w:r>
+              <w:rPr>
+                <w:rFonts w:eastAsiaTheme="majorEastAsia"/>
+              </w:rPr>
+              <w:t>Service Kependudukan (Node 2)</w:t>
+            </w:r>
+          </w:p>
+        </w:tc>
+        <w:tc>
+          <w:tcPr>
+            <w:tcW w:w="1568" w:type="dxa"/>
+          </w:tcPr>
+          <w:p>
+            <w:pPr>
+              <w:rPr>
+                <w:rFonts w:eastAsiaTheme="majorEastAsia"/>
+                <w:lang w:val="da-DK"/>
+              </w:rPr>
+            </w:pPr>
+            <w:r>
+              <w:rPr>
+                <w:rFonts w:eastAsiaTheme="majorEastAsia"/>
+              </w:rPr>
+              <w:t>service-kependudukan-2</w:t>
+            </w:r>
+          </w:p>
+        </w:tc>
+        <w:tc>
+          <w:tcPr>
+            <w:tcW w:w="1203" w:type="dxa"/>
+          </w:tcPr>
+          <w:p>
+            <w:pPr>
+              <w:rPr>
+                <w:rFonts w:eastAsiaTheme="majorEastAsia"/>
+                <w:lang w:val="da-DK"/>
+              </w:rPr>
+            </w:pPr>
+            <w:r>
+              <w:rPr>
+                <w:rFonts w:eastAsiaTheme="majorEastAsia"/>
+                <w:lang w:val="da-DK"/>
+              </w:rPr>
+              <w:t>3000</w:t>
+            </w:r>
+          </w:p>
+        </w:tc>
+        <w:tc>
+          <w:tcPr>
+            <w:tcW w:w="1983" w:type="dxa"/>
+          </w:tcPr>
+          <w:p>
+            <w:pPr>
+              <w:rPr>
+                <w:rFonts w:eastAsiaTheme="majorEastAsia"/>
+                <w:lang w:val="da-DK"/>
+              </w:rPr>
+            </w:pPr>
+            <w:r>
+              <w:rPr>
+                <w:rFonts w:eastAsiaTheme="majorEastAsia"/>
+                <w:i/>
+                <w:iCs/>
+              </w:rPr>
+              <w:t>None (Tertutup)</w:t>
+            </w:r>
+          </w:p>
+        </w:tc>
+        <w:tc>
+          <w:tcPr>
+            <w:tcW w:w="1629" w:type="dxa"/>
+          </w:tcPr>
+          <w:p>
+            <w:pPr>
+              <w:rPr>
+                <w:rFonts w:eastAsiaTheme="majorEastAsia"/>
+                <w:lang w:val="en-ID"/>
+              </w:rPr>
+            </w:pPr>
+            <w:r>
+              <w:rPr>
+                <w:rFonts w:eastAsiaTheme="majorEastAsia"/>
+              </w:rPr>
+              <w:t xml:space="preserve">Replikasi aktif Mock API Kependudukan (Delay 50ms) untuk </w:t>
+            </w:r>
+            <w:r>
+              <w:rPr>
+                <w:rFonts w:eastAsiaTheme="majorEastAsia"/>
+                <w:i/>
+                <w:iCs/>
+              </w:rPr>
+              <w:t>Active-Active HA</w:t>
+            </w:r>
+            <w:r>
+              <w:rPr>
+                <w:rFonts w:eastAsiaTheme="majorEastAsia"/>
+              </w:rPr>
+              <w:t xml:space="preserve"> dan </w:t>
+            </w:r>
+            <w:r>
+              <w:rPr>
+                <w:rFonts w:eastAsiaTheme="majorEastAsia"/>
+                <w:i/>
+                <w:iCs/>
+              </w:rPr>
+              <w:t>failover</w:t>
+            </w:r>
+            <w:r>
+              <w:rPr>
+                <w:rFonts w:eastAsiaTheme="majorEastAsia"/>
+              </w:rPr>
+              <w:t>.</w:t>
+            </w:r>
+          </w:p>
+        </w:tc>
+      </w:tr>
+      <w:tr>
+        <w:tc>
+          <w:tcPr>
+            <w:tcW w:w="1544" w:type="dxa"/>
+          </w:tcPr>
+          <w:p>
+            <w:pPr>
+              <w:rPr>
+                <w:rFonts w:eastAsiaTheme="majorEastAsia"/>
+              </w:rPr>
+            </w:pPr>
+            <w:r>
+              <w:rPr>
+                <w:rFonts w:eastAsiaTheme="majorEastAsia"/>
+              </w:rPr>
+              <w:t>Service Pajak (Node 1)</w:t>
+            </w:r>
+          </w:p>
+        </w:tc>
+        <w:tc>
+          <w:tcPr>
+            <w:tcW w:w="1568" w:type="dxa"/>
+          </w:tcPr>
+          <w:p>
+            <w:pPr>
+              <w:rPr>
+                <w:rFonts w:eastAsiaTheme="majorEastAsia"/>
+              </w:rPr>
+            </w:pPr>
+            <w:r>
+              <w:rPr>
+                <w:rFonts w:eastAsiaTheme="majorEastAsia"/>
+              </w:rPr>
+              <w:t>service-pajak-1</w:t>
+            </w:r>
+          </w:p>
+        </w:tc>
+        <w:tc>
+          <w:tcPr>
+            <w:tcW w:w="1203" w:type="dxa"/>
+          </w:tcPr>
+          <w:p>
+            <w:pPr>
+              <w:rPr>
+                <w:rFonts w:eastAsiaTheme="majorEastAsia"/>
+                <w:lang w:val="en-ID"/>
+              </w:rPr>
+            </w:pPr>
+            <w:r>
+              <w:rPr>
+                <w:rFonts w:eastAsiaTheme="majorEastAsia"/>
+                <w:lang w:val="en-ID"/>
+              </w:rPr>
+              <w:t>3000</w:t>
+            </w:r>
+          </w:p>
+        </w:tc>
+        <w:tc>
+          <w:tcPr>
+            <w:tcW w:w="1983" w:type="dxa"/>
+          </w:tcPr>
+          <w:p>
+            <w:pPr>
+              <w:rPr>
+                <w:rFonts w:eastAsiaTheme="majorEastAsia"/>
+                <w:i/>
+                <w:iCs/>
+              </w:rPr>
+            </w:pPr>
+            <w:r>
+              <w:rPr>
+                <w:rFonts w:eastAsiaTheme="majorEastAsia"/>
+                <w:i/>
+                <w:iCs/>
+              </w:rPr>
+              <w:t>None (Tertutup)</w:t>
+            </w:r>
+          </w:p>
+        </w:tc>
+        <w:tc>
+          <w:tcPr>
+            <w:tcW w:w="1629" w:type="dxa"/>
+          </w:tcPr>
+          <w:p>
+            <w:pPr>
+              <w:rPr>
+                <w:rFonts w:eastAsiaTheme="majorEastAsia"/>
+              </w:rPr>
+            </w:pPr>
+            <w:r>
+              <w:rPr>
+                <w:rFonts w:eastAsiaTheme="majorEastAsia"/>
+              </w:rPr>
+              <w:t>Mock API Pajak (Delay 100ms), melayani trafik rotasi dari Load Balancer.</w:t>
+            </w:r>
+          </w:p>
+        </w:tc>
+      </w:tr>
+      <w:tr>
+        <w:tc>
+          <w:tcPr>
+            <w:tcW w:w="1544" w:type="dxa"/>
+          </w:tcPr>
+          <w:p>
+            <w:pPr>
+              <w:rPr>
+                <w:rFonts w:eastAsiaTheme="majorEastAsia"/>
+              </w:rPr>
+            </w:pPr>
+            <w:r>
+              <w:rPr>
+                <w:rFonts w:eastAsiaTheme="majorEastAsia"/>
+              </w:rPr>
+              <w:t>Service Pajak (Node 2)</w:t>
+            </w:r>
+          </w:p>
+        </w:tc>
+        <w:tc>
+          <w:tcPr>
+            <w:tcW w:w="1568" w:type="dxa"/>
+          </w:tcPr>
+          <w:p>
+            <w:pPr>
+              <w:rPr>
+                <w:rFonts w:eastAsiaTheme="majorEastAsia"/>
+              </w:rPr>
+            </w:pPr>
+            <w:r>
+              <w:rPr>
+                <w:rFonts w:eastAsiaTheme="majorEastAsia"/>
+              </w:rPr>
+              <w:t>service-pajak-2</w:t>
+            </w:r>
+          </w:p>
+        </w:tc>
+        <w:tc>
+          <w:tcPr>
+            <w:tcW w:w="1203" w:type="dxa"/>
+          </w:tcPr>
+          <w:p>
+            <w:pPr>
+              <w:rPr>
+                <w:rFonts w:eastAsiaTheme="majorEastAsia"/>
+                <w:lang w:val="en-ID"/>
+              </w:rPr>
+            </w:pPr>
+            <w:r>
+              <w:rPr>
+                <w:rFonts w:eastAsiaTheme="majorEastAsia"/>
+                <w:lang w:val="en-ID"/>
+              </w:rPr>
+              <w:t>3000</w:t>
+            </w:r>
+          </w:p>
+        </w:tc>
+        <w:tc>
+          <w:tcPr>
+            <w:tcW w:w="1983" w:type="dxa"/>
+          </w:tcPr>
+          <w:p>
+            <w:pPr>
+              <w:rPr>
+                <w:rFonts w:eastAsiaTheme="majorEastAsia"/>
+                <w:i/>
+                <w:iCs/>
+              </w:rPr>
+            </w:pPr>
+            <w:r>
+              <w:rPr>
+                <w:rFonts w:eastAsiaTheme="majorEastAsia"/>
+                <w:i/>
+                <w:iCs/>
+              </w:rPr>
+              <w:t>None (Tertutup)</w:t>
+            </w:r>
+          </w:p>
+        </w:tc>
+        <w:tc>
+          <w:tcPr>
+            <w:tcW w:w="1629" w:type="dxa"/>
+          </w:tcPr>
+          <w:p>
+            <w:pPr>
+              <w:rPr>
+                <w:rFonts w:eastAsiaTheme="majorEastAsia"/>
+              </w:rPr>
+            </w:pPr>
+            <w:r>
+              <w:rPr>
+                <w:rFonts w:eastAsiaTheme="majorEastAsia"/>
+              </w:rPr>
+              <w:t xml:space="preserve">Replikasi aktif Mock API Pajak (Delay 100ms) untuk </w:t>
+            </w:r>
+            <w:r>
+              <w:rPr>
+                <w:rFonts w:eastAsiaTheme="majorEastAsia"/>
+                <w:i/>
+                <w:iCs/>
+              </w:rPr>
+              <w:t xml:space="preserve">Active-Active </w:t>
+            </w:r>
+            <w:r>
+              <w:rPr>
+                <w:rFonts w:eastAsiaTheme="majorEastAsia"/>
+                <w:i/>
+                <w:iCs/>
+              </w:rPr>
+              <w:lastRenderedPageBreak/>
+              <w:t>HA</w:t>
+            </w:r>
+            <w:r>
+              <w:rPr>
+                <w:rFonts w:eastAsiaTheme="majorEastAsia"/>
+              </w:rPr>
+              <w:t xml:space="preserve"> dan </w:t>
+            </w:r>
+            <w:r>
+              <w:rPr>
+                <w:rFonts w:eastAsiaTheme="majorEastAsia"/>
+                <w:i/>
+                <w:iCs/>
+              </w:rPr>
+              <w:t>failover</w:t>
+            </w:r>
+            <w:r>
+              <w:rPr>
+                <w:rFonts w:eastAsiaTheme="majorEastAsia"/>
+              </w:rPr>
+              <w:t>.</w:t>
             </w:r>
           </w:p>
         </w:tc>
@@ -2029,15 +3340,15 @@
       <w:pPr>
         <w:rPr>
           <w:rFonts w:eastAsiaTheme="majorEastAsia"/>
-          <w:lang w:val="da-DK"/>
-        </w:rPr>
-      </w:pPr>
-    </w:p>
-    <w:p>
-      <w:pPr>
-        <w:rPr>
-          <w:rFonts w:eastAsiaTheme="majorEastAsia"/>
-          <w:lang w:val="da-DK"/>
+          <w:lang w:val="en-ID"/>
+        </w:rPr>
+      </w:pPr>
+    </w:p>
+    <w:p>
+      <w:pPr>
+        <w:rPr>
+          <w:rFonts w:eastAsiaTheme="majorEastAsia"/>
+          <w:lang w:val="en-ID"/>
         </w:rPr>
       </w:pPr>
     </w:p>
@@ -2086,11 +3397,33 @@
         </w:rPr>
         <w:t xml:space="preserve">4.1 </w:t>
       </w:r>
-      <w:r>
-        <w:rPr>
-          <w:lang w:val="en-ID"/>
-        </w:rPr>
-        <w:t>Penegakan Batasan Sumber Daya (</w:t>
+      <w:proofErr w:type="spellStart"/>
+      <w:r>
+        <w:rPr>
+          <w:lang w:val="en-ID"/>
+        </w:rPr>
+        <w:t>Penegakan</w:t>
+      </w:r>
+      <w:proofErr w:type="spellEnd"/>
+      <w:r>
+        <w:rPr>
+          <w:lang w:val="en-ID"/>
+        </w:rPr>
+        <w:t xml:space="preserve"> Batasan </w:t>
+      </w:r>
+      <w:proofErr w:type="spellStart"/>
+      <w:r>
+        <w:rPr>
+          <w:lang w:val="en-ID"/>
+        </w:rPr>
+        <w:t>Sumber</w:t>
+      </w:r>
+      <w:proofErr w:type="spellEnd"/>
+      <w:r>
+        <w:rPr>
+          <w:lang w:val="en-ID"/>
+        </w:rPr>
+        <w:t xml:space="preserve"> Daya (</w:t>
       </w:r>
       <w:r>
         <w:rPr>
@@ -2152,7 +3485,55 @@
           <w:rFonts w:eastAsiaTheme="majorEastAsia"/>
           <w:lang w:val="en-ID"/>
         </w:rPr>
-        <w:t>Batas CPU: cpus: '0.25' (Maksimal 25% dari 1 core CPU host)</w:t>
+        <w:t xml:space="preserve">Batas CPU: </w:t>
+      </w:r>
+      <w:proofErr w:type="spellStart"/>
+      <w:r>
+        <w:rPr>
+          <w:rFonts w:eastAsiaTheme="majorEastAsia"/>
+          <w:lang w:val="en-ID"/>
+        </w:rPr>
+        <w:t>cpus</w:t>
+      </w:r>
+      <w:proofErr w:type="spellEnd"/>
+      <w:r>
+        <w:rPr>
+          <w:rFonts w:eastAsiaTheme="majorEastAsia"/>
+          <w:lang w:val="en-ID"/>
+        </w:rPr>
+        <w:t>: '0.25' (</w:t>
+      </w:r>
+      <w:proofErr w:type="spellStart"/>
+      <w:r>
+        <w:rPr>
+          <w:rFonts w:eastAsiaTheme="majorEastAsia"/>
+          <w:lang w:val="en-ID"/>
+        </w:rPr>
+        <w:t>Maksimal</w:t>
+      </w:r>
+      <w:proofErr w:type="spellEnd"/>
+      <w:r>
+        <w:rPr>
+          <w:rFonts w:eastAsiaTheme="majorEastAsia"/>
+          <w:lang w:val="en-ID"/>
+        </w:rPr>
+        <w:t xml:space="preserve"> 25% </w:t>
+      </w:r>
+      <w:proofErr w:type="spellStart"/>
+      <w:r>
+        <w:rPr>
+          <w:rFonts w:eastAsiaTheme="majorEastAsia"/>
+          <w:lang w:val="en-ID"/>
+        </w:rPr>
+        <w:t>dari</w:t>
+      </w:r>
+      <w:proofErr w:type="spellEnd"/>
+      <w:r>
+        <w:rPr>
+          <w:rFonts w:eastAsiaTheme="majorEastAsia"/>
+          <w:lang w:val="en-ID"/>
+        </w:rPr>
+        <w:t xml:space="preserve"> 1 core CPU host)</w:t>
       </w:r>
     </w:p>
     <w:p>
@@ -2172,7 +3553,23 @@
           <w:rFonts w:eastAsiaTheme="majorEastAsia"/>
           <w:lang w:val="en-ID"/>
         </w:rPr>
-        <w:t>Batas Memori: memory: 256M (Maksimal RAM 256 MB per container)</w:t>
+        <w:t>Batas Memori: memory: 256M (</w:t>
+      </w:r>
+      <w:proofErr w:type="spellStart"/>
+      <w:r>
+        <w:rPr>
+          <w:rFonts w:eastAsiaTheme="majorEastAsia"/>
+          <w:lang w:val="en-ID"/>
+        </w:rPr>
+        <w:t>Maksimal</w:t>
+      </w:r>
+      <w:proofErr w:type="spellEnd"/>
+      <w:r>
+        <w:rPr>
+          <w:rFonts w:eastAsiaTheme="majorEastAsia"/>
+          <w:lang w:val="en-ID"/>
+        </w:rPr>
+        <w:t xml:space="preserve"> RAM 256 MB per container)</w:t>
       </w:r>
     </w:p>
     <w:p>
@@ -2188,12 +3585,56 @@
         </w:rPr>
         <w:t xml:space="preserve">4.2 </w:t>
       </w:r>
-      <w:r>
-        <w:rPr>
-          <w:lang w:val="en-ID"/>
-        </w:rPr>
-        <w:t>Optimasi Single-Worker untuk Lingkungan Terbatas</w:t>
-      </w:r>
+      <w:proofErr w:type="spellStart"/>
+      <w:r>
+        <w:rPr>
+          <w:lang w:val="en-ID"/>
+        </w:rPr>
+        <w:t>Optimasi</w:t>
+      </w:r>
+      <w:proofErr w:type="spellEnd"/>
+      <w:r>
+        <w:rPr>
+          <w:lang w:val="en-ID"/>
+        </w:rPr>
+        <w:t xml:space="preserve"> Single-Worker </w:t>
+      </w:r>
+      <w:proofErr w:type="spellStart"/>
+      <w:r>
+        <w:rPr>
+          <w:lang w:val="en-ID"/>
+        </w:rPr>
+        <w:t>untuk</w:t>
+      </w:r>
+      <w:proofErr w:type="spellEnd"/>
+      <w:r>
+        <w:rPr>
+          <w:lang w:val="en-ID"/>
+        </w:rPr>
+        <w:t xml:space="preserve"> </w:t>
+      </w:r>
+      <w:proofErr w:type="spellStart"/>
+      <w:r>
+        <w:rPr>
+          <w:lang w:val="en-ID"/>
+        </w:rPr>
+        <w:t>Lingkungan</w:t>
+      </w:r>
+      <w:proofErr w:type="spellEnd"/>
+      <w:r>
+        <w:rPr>
+          <w:lang w:val="en-ID"/>
+        </w:rPr>
+        <w:t xml:space="preserve"> </w:t>
+      </w:r>
+      <w:proofErr w:type="spellStart"/>
+      <w:r>
+        <w:rPr>
+          <w:lang w:val="en-ID"/>
+        </w:rPr>
+        <w:t>Terbatas</w:t>
+      </w:r>
+      <w:proofErr w:type="spellEnd"/>
     </w:p>
     <w:p>
       <w:pPr>
@@ -2262,36 +3703,670 @@
         <w:rPr>
           <w:rFonts w:eastAsiaTheme="majorEastAsia"/>
         </w:rPr>
+        <w:t xml:space="preserve">  KONG_MEM_CACHE_SIZE: "32m"</w:t>
+      </w:r>
+    </w:p>
+    <w:p>
+      <w:pPr>
+        <w:rPr>
+          <w:rFonts w:eastAsiaTheme="majorEastAsia"/>
+        </w:rPr>
+      </w:pPr>
+      <w:r>
+        <w:rPr>
+          <w:rFonts w:eastAsiaTheme="majorEastAsia"/>
+        </w:rPr>
+        <w:t>Konfigurasi ini memastikan Gateway berjalan stabil dengan konsumsi RAM rendah (~40 MB) tanpa menyebabkan lonjakan CPU pada sistem operasi host.</w:t>
+      </w:r>
+    </w:p>
+    <w:p>
+      <w:pPr>
+        <w:pStyle w:val="Heading2"/>
+      </w:pPr>
+      <w:r>
+        <w:t xml:space="preserve">4.3 </w:t>
+      </w:r>
+      <w:r>
+        <w:rPr>
+          <w:bCs/>
+        </w:rPr>
+        <w:t>Hasil Pengujian Deployment &amp; Verifikasi Lingkungan</w:t>
+      </w:r>
+    </w:p>
+    <w:p>
+      <w:pPr>
+        <w:ind w:firstLine="720"/>
+        <w:rPr>
+          <w:rFonts w:eastAsiaTheme="majorEastAsia"/>
+        </w:rPr>
+      </w:pPr>
+      <w:r>
+        <w:rPr>
+          <w:rFonts w:eastAsiaTheme="majorEastAsia"/>
+        </w:rPr>
+        <w:t>Sebagai pemenuhan luaran Pertemuan 2 (</w:t>
+      </w:r>
+      <w:r>
+        <w:rPr>
+          <w:rFonts w:eastAsiaTheme="majorEastAsia"/>
+          <w:i/>
+          <w:iCs/>
+        </w:rPr>
+        <w:t>Environment Setup &amp; Core Deployment</w:t>
+      </w:r>
+      <w:r>
+        <w:rPr>
+          <w:rFonts w:eastAsiaTheme="majorEastAsia"/>
+        </w:rPr>
+        <w:t>), seluruh komponen sistem telah berhasil dibangun dan diuji pada lingkungan Docker Desktop host. Berikut adalah dokumentasi bukti verifikasi sistem:</w:t>
+      </w:r>
+    </w:p>
+    <w:p>
+      <w:pPr>
+        <w:pStyle w:val="ListParagraph"/>
+        <w:numPr>
+          <w:ilvl w:val="0"/>
+          <w:numId w:val="13"/>
+        </w:numPr>
+        <w:rPr>
+          <w:rFonts w:eastAsiaTheme="majorEastAsia"/>
+        </w:rPr>
+      </w:pPr>
+      <w:r>
+        <w:rPr>
+          <w:rFonts w:eastAsiaTheme="majorEastAsia"/>
+          <w:b/>
+          <w:bCs/>
+        </w:rPr>
+        <w:t>Verifikasi Status Kontainer (Core Deployment)</w:t>
+      </w:r>
+    </w:p>
+    <w:p>
+      <w:pPr>
+        <w:pStyle w:val="ListParagraph"/>
+        <w:rPr>
+          <w:rFonts w:eastAsiaTheme="majorEastAsia"/>
+        </w:rPr>
+      </w:pPr>
+      <w:r>
+        <w:rPr>
+          <w:rFonts w:eastAsiaTheme="majorEastAsia"/>
+        </w:rPr>
+        <w:t>Seluruh 7 kontainer berhasil dibuat dan berjalan normal (</w:t>
+      </w:r>
+      <w:r>
+        <w:rPr>
+          <w:rFonts w:eastAsiaTheme="majorEastAsia"/>
+          <w:i/>
+          <w:iCs/>
+        </w:rPr>
+        <w:t>Up</w:t>
+      </w:r>
+      <w:r>
+        <w:rPr>
+          <w:rFonts w:eastAsiaTheme="majorEastAsia"/>
+        </w:rPr>
+        <w:t>) dalam jaringan terisolasi smartcity-net.</w:t>
+      </w:r>
+    </w:p>
+    <w:p>
+      <w:pPr>
+        <w:pStyle w:val="ListParagraph"/>
+        <w:rPr>
+          <w:rFonts w:eastAsiaTheme="majorEastAsia"/>
+        </w:rPr>
+      </w:pPr>
+      <w:r>
+        <w:rPr>
+          <w:rFonts w:eastAsiaTheme="majorEastAsia"/>
+        </w:rPr>
+        <w:drawing>
+          <wp:inline distT="0" distB="0" distL="0" distR="0" wp14:anchorId="6FB9E295" wp14:editId="7A4C7B9A">
+            <wp:extent cx="5039995" cy="807085"/>
+            <wp:effectExtent l="0" t="0" r="8255" b="0"/>
+            <wp:docPr id="555251137" name="Picture 1"/>
+            <wp:cNvGraphicFramePr>
+              <a:graphicFrameLocks xmlns:a="http://schemas.openxmlformats.org/drawingml/2006/main" noChangeAspect="1"/>
+            </wp:cNvGraphicFramePr>
+            <a:graphic xmlns:a="http://schemas.openxmlformats.org/drawingml/2006/main">
+              <a:graphicData uri="http://schemas.openxmlformats.org/drawingml/2006/picture">
+                <pic:pic xmlns:pic="http://schemas.openxmlformats.org/drawingml/2006/picture">
+                  <pic:nvPicPr>
+                    <pic:cNvPr id="555251137" name=""/>
+                    <pic:cNvPicPr/>
+                  </pic:nvPicPr>
+                  <pic:blipFill>
+                    <a:blip r:embed="rId10"/>
+                    <a:stretch>
+                      <a:fillRect/>
+                    </a:stretch>
+                  </pic:blipFill>
+                  <pic:spPr>
+                    <a:xfrm>
+                      <a:off x="0" y="0"/>
+                      <a:ext cx="5039995" cy="807085"/>
+                    </a:xfrm>
+                    <a:prstGeom prst="rect">
+                      <a:avLst/>
+                    </a:prstGeom>
+                  </pic:spPr>
+                </pic:pic>
+              </a:graphicData>
+            </a:graphic>
+          </wp:inline>
+        </w:drawing>
+      </w:r>
+    </w:p>
+    <w:p>
+      <w:pPr>
+        <w:pStyle w:val="ListParagraph"/>
+        <w:rPr>
+          <w:rFonts w:eastAsiaTheme="majorEastAsia"/>
+        </w:rPr>
+      </w:pPr>
+      <w:r>
+        <w:rPr>
+          <w:rFonts w:eastAsiaTheme="majorEastAsia"/>
+        </w:rPr>
         <w:lastRenderedPageBreak/>
-        <w:t xml:space="preserve">  KONG_MEM_CACHE_SIZE: "32m"</w:t>
-      </w:r>
-    </w:p>
-    <w:p>
-      <w:pPr>
-        <w:rPr>
-          <w:rFonts w:eastAsiaTheme="majorEastAsia"/>
-        </w:rPr>
-      </w:pPr>
-      <w:r>
-        <w:rPr>
-          <w:rFonts w:eastAsiaTheme="majorEastAsia"/>
-        </w:rPr>
-        <w:t>Konfigurasi ini memastikan Gateway berjalan stabil dengan konsumsi RAM rendah (~40 MB) tanpa menyebabkan lonjakan CPU pada sistem operasi host.</w:t>
-      </w:r>
-    </w:p>
-    <w:p>
-      <w:pPr>
-        <w:rPr>
-          <w:rFonts w:eastAsiaTheme="majorEastAsia"/>
-        </w:rPr>
-      </w:pPr>
-    </w:p>
-    <w:p>
-      <w:pPr>
-        <w:rPr>
-          <w:rFonts w:eastAsiaTheme="majorEastAsia"/>
-        </w:rPr>
-      </w:pPr>
+        <w:t>Berdasarkan Gambar 4.1, terlihat bahwa Kong Gateway, sepasang Redis Master-Replica, serta 4 worker microservices telah beroperasi tanpa kegagalan startup.</w:t>
+      </w:r>
+    </w:p>
+    <w:p>
+      <w:pPr>
+        <w:pStyle w:val="ListParagraph"/>
+        <w:numPr>
+          <w:ilvl w:val="0"/>
+          <w:numId w:val="13"/>
+        </w:numPr>
+        <w:rPr>
+          <w:rFonts w:eastAsiaTheme="majorEastAsia"/>
+        </w:rPr>
+      </w:pPr>
+      <w:r>
+        <w:rPr>
+          <w:rFonts w:eastAsiaTheme="majorEastAsia"/>
+          <w:b/>
+          <w:bCs/>
+        </w:rPr>
+        <w:t>Verifikasi Batasan Sumber Daya (</w:t>
+      </w:r>
+      <w:r>
+        <w:rPr>
+          <w:rFonts w:eastAsiaTheme="majorEastAsia"/>
+          <w:b/>
+          <w:bCs/>
+          <w:i/>
+          <w:iCs/>
+        </w:rPr>
+        <w:t>Resource Limits</w:t>
+      </w:r>
+      <w:r>
+        <w:rPr>
+          <w:rFonts w:eastAsiaTheme="majorEastAsia"/>
+          <w:b/>
+          <w:bCs/>
+        </w:rPr>
+        <w:t>)</w:t>
+      </w:r>
+    </w:p>
+    <w:p>
+      <w:pPr>
+        <w:pStyle w:val="ListParagraph"/>
+        <w:rPr>
+          <w:rFonts w:eastAsiaTheme="majorEastAsia"/>
+        </w:rPr>
+      </w:pPr>
+      <w:r>
+        <w:rPr>
+          <w:rFonts w:eastAsiaTheme="majorEastAsia"/>
+        </w:rPr>
+        <w:t>Penegakan batasan sumber daya diuji menggunakan pemantauan langsung kernel melalui docker stats.</w:t>
+      </w:r>
+    </w:p>
+    <w:p>
+      <w:pPr>
+        <w:pStyle w:val="ListParagraph"/>
+        <w:rPr>
+          <w:rFonts w:eastAsiaTheme="majorEastAsia"/>
+        </w:rPr>
+      </w:pPr>
+      <w:r>
+        <w:rPr>
+          <w:rFonts w:eastAsiaTheme="majorEastAsia"/>
+        </w:rPr>
+        <w:drawing>
+          <wp:inline distT="0" distB="0" distL="0" distR="0" wp14:anchorId="727C7FD1" wp14:editId="1114F687">
+            <wp:extent cx="5039995" cy="954405"/>
+            <wp:effectExtent l="0" t="0" r="8255" b="0"/>
+            <wp:docPr id="840520176" name="Picture 1"/>
+            <wp:cNvGraphicFramePr>
+              <a:graphicFrameLocks xmlns:a="http://schemas.openxmlformats.org/drawingml/2006/main" noChangeAspect="1"/>
+            </wp:cNvGraphicFramePr>
+            <a:graphic xmlns:a="http://schemas.openxmlformats.org/drawingml/2006/main">
+              <a:graphicData uri="http://schemas.openxmlformats.org/drawingml/2006/picture">
+                <pic:pic xmlns:pic="http://schemas.openxmlformats.org/drawingml/2006/picture">
+                  <pic:nvPicPr>
+                    <pic:cNvPr id="840520176" name=""/>
+                    <pic:cNvPicPr/>
+                  </pic:nvPicPr>
+                  <pic:blipFill>
+                    <a:blip r:embed="rId11"/>
+                    <a:stretch>
+                      <a:fillRect/>
+                    </a:stretch>
+                  </pic:blipFill>
+                  <pic:spPr>
+                    <a:xfrm>
+                      <a:off x="0" y="0"/>
+                      <a:ext cx="5039995" cy="954405"/>
+                    </a:xfrm>
+                    <a:prstGeom prst="rect">
+                      <a:avLst/>
+                    </a:prstGeom>
+                  </pic:spPr>
+                </pic:pic>
+              </a:graphicData>
+            </a:graphic>
+          </wp:inline>
+        </w:drawing>
+      </w:r>
+    </w:p>
+    <w:p>
+      <w:pPr>
+        <w:pStyle w:val="ListParagraph"/>
+        <w:rPr>
+          <w:rFonts w:eastAsiaTheme="majorEastAsia"/>
+        </w:rPr>
+      </w:pPr>
+      <w:r>
+        <w:rPr>
+          <w:rFonts w:eastAsiaTheme="majorEastAsia"/>
+        </w:rPr>
+        <w:t>Berdasarkan Gambar 4.2, kolom MEM LIMIT menunjukkan bahwa setiap kontainer terkunci tepat pada batas 256 MiB dengan penggunaan RAM riil yang sangat efisien (berkisar antara 10 MB hingga 45 MB per kontainer).</w:t>
+      </w:r>
+    </w:p>
+    <w:p>
+      <w:pPr>
+        <w:pStyle w:val="ListParagraph"/>
+        <w:numPr>
+          <w:ilvl w:val="0"/>
+          <w:numId w:val="13"/>
+        </w:numPr>
+        <w:rPr>
+          <w:rFonts w:eastAsiaTheme="majorEastAsia"/>
+        </w:rPr>
+      </w:pPr>
+      <w:r>
+        <w:rPr>
+          <w:rFonts w:eastAsiaTheme="majorEastAsia"/>
+          <w:b/>
+          <w:bCs/>
+        </w:rPr>
+        <w:t>Verifikasi Fungsionalitas Load Balancing &amp; Rate Limiting</w:t>
+      </w:r>
+    </w:p>
+    <w:p>
+      <w:pPr>
+        <w:pStyle w:val="ListParagraph"/>
+        <w:rPr>
+          <w:rFonts w:eastAsiaTheme="majorEastAsia"/>
+        </w:rPr>
+      </w:pPr>
+      <w:r>
+        <w:rPr>
+          <w:rFonts w:eastAsiaTheme="majorEastAsia"/>
+        </w:rPr>
+        <w:t>Pengujian fungsionalitas dan ketahanan dilakukan menggunakan skrip otomatisasi Python.</w:t>
+      </w:r>
+    </w:p>
+    <w:p>
+      <w:pPr>
+        <w:pStyle w:val="ListParagraph"/>
+        <w:jc w:val="center"/>
+        <w:rPr>
+          <w:rFonts w:eastAsiaTheme="majorEastAsia"/>
+        </w:rPr>
+      </w:pPr>
+      <w:r>
+        <w:rPr>
+          <w:rFonts w:eastAsiaTheme="majorEastAsia"/>
+        </w:rPr>
+        <w:drawing>
+          <wp:inline distT="0" distB="0" distL="0" distR="0" wp14:anchorId="654CCBE9" wp14:editId="2FA974F9">
+            <wp:extent cx="2261143" cy="3506345"/>
+            <wp:effectExtent l="0" t="0" r="6350" b="0"/>
+            <wp:docPr id="2116246074" name="Picture 1"/>
+            <wp:cNvGraphicFramePr>
+              <a:graphicFrameLocks xmlns:a="http://schemas.openxmlformats.org/drawingml/2006/main" noChangeAspect="1"/>
+            </wp:cNvGraphicFramePr>
+            <a:graphic xmlns:a="http://schemas.openxmlformats.org/drawingml/2006/main">
+              <a:graphicData uri="http://schemas.openxmlformats.org/drawingml/2006/picture">
+                <pic:pic xmlns:pic="http://schemas.openxmlformats.org/drawingml/2006/picture">
+                  <pic:nvPicPr>
+                    <pic:cNvPr id="2116246074" name=""/>
+                    <pic:cNvPicPr/>
+                  </pic:nvPicPr>
+                  <pic:blipFill>
+                    <a:blip r:embed="rId12"/>
+                    <a:stretch>
+                      <a:fillRect/>
+                    </a:stretch>
+                  </pic:blipFill>
+                  <pic:spPr>
+                    <a:xfrm>
+                      <a:off x="0" y="0"/>
+                      <a:ext cx="2269802" cy="3519773"/>
+                    </a:xfrm>
+                    <a:prstGeom prst="rect">
+                      <a:avLst/>
+                    </a:prstGeom>
+                  </pic:spPr>
+                </pic:pic>
+              </a:graphicData>
+            </a:graphic>
+          </wp:inline>
+        </w:drawing>
+      </w:r>
+    </w:p>
+    <w:p>
+      <w:pPr>
+        <w:pStyle w:val="ListParagraph"/>
+        <w:rPr>
+          <w:rFonts w:eastAsiaTheme="majorEastAsia"/>
+          <w:lang w:val="da-DK"/>
+        </w:rPr>
+      </w:pPr>
+      <w:r>
+        <w:rPr>
+          <w:rFonts w:eastAsiaTheme="majorEastAsia"/>
+          <w:lang w:val="da-DK"/>
+        </w:rPr>
+        <w:t>Berdasarkan Gambar 4.3, pengujian membuktikan dua hal krusial:</w:t>
+      </w:r>
+    </w:p>
+    <w:p>
+      <w:pPr>
+        <w:pStyle w:val="ListParagraph"/>
+        <w:numPr>
+          <w:ilvl w:val="0"/>
+          <w:numId w:val="14"/>
+        </w:numPr>
+        <w:rPr>
+          <w:rFonts w:eastAsiaTheme="majorEastAsia"/>
+          <w:lang w:val="en-ID"/>
+        </w:rPr>
+      </w:pPr>
+      <w:proofErr w:type="spellStart"/>
+      <w:r>
+        <w:rPr>
+          <w:rFonts w:eastAsiaTheme="majorEastAsia"/>
+          <w:lang w:val="en-ID"/>
+        </w:rPr>
+        <w:t>Trafik</w:t>
+      </w:r>
+      <w:proofErr w:type="spellEnd"/>
+      <w:r>
+        <w:rPr>
+          <w:rFonts w:eastAsiaTheme="majorEastAsia"/>
+          <w:lang w:val="en-ID"/>
+        </w:rPr>
+        <w:t xml:space="preserve"> </w:t>
+      </w:r>
+      <w:proofErr w:type="spellStart"/>
+      <w:r>
+        <w:rPr>
+          <w:rFonts w:eastAsiaTheme="majorEastAsia"/>
+          <w:lang w:val="en-ID"/>
+        </w:rPr>
+        <w:t>ke</w:t>
+      </w:r>
+      <w:proofErr w:type="spellEnd"/>
+      <w:r>
+        <w:rPr>
+          <w:rFonts w:eastAsiaTheme="majorEastAsia"/>
+          <w:lang w:val="en-ID"/>
+        </w:rPr>
+        <w:t xml:space="preserve"> Service </w:t>
+      </w:r>
+      <w:proofErr w:type="spellStart"/>
+      <w:r>
+        <w:rPr>
+          <w:rFonts w:eastAsiaTheme="majorEastAsia"/>
+          <w:lang w:val="en-ID"/>
+        </w:rPr>
+        <w:t>Kependudukan</w:t>
+      </w:r>
+      <w:proofErr w:type="spellEnd"/>
+      <w:r>
+        <w:rPr>
+          <w:rFonts w:eastAsiaTheme="majorEastAsia"/>
+          <w:lang w:val="en-ID"/>
+        </w:rPr>
+        <w:t xml:space="preserve"> </w:t>
+      </w:r>
+      <w:proofErr w:type="spellStart"/>
+      <w:r>
+        <w:rPr>
+          <w:rFonts w:eastAsiaTheme="majorEastAsia"/>
+          <w:lang w:val="en-ID"/>
+        </w:rPr>
+        <w:t>berhasil</w:t>
+      </w:r>
+      <w:proofErr w:type="spellEnd"/>
+      <w:r>
+        <w:rPr>
+          <w:rFonts w:eastAsiaTheme="majorEastAsia"/>
+          <w:lang w:val="en-ID"/>
+        </w:rPr>
+        <w:t xml:space="preserve"> </w:t>
+      </w:r>
+      <w:proofErr w:type="spellStart"/>
+      <w:r>
+        <w:rPr>
+          <w:rFonts w:eastAsiaTheme="majorEastAsia"/>
+          <w:lang w:val="en-ID"/>
+        </w:rPr>
+        <w:t>dibagi</w:t>
+      </w:r>
+      <w:proofErr w:type="spellEnd"/>
+      <w:r>
+        <w:rPr>
+          <w:rFonts w:eastAsiaTheme="majorEastAsia"/>
+          <w:lang w:val="en-ID"/>
+        </w:rPr>
+        <w:t xml:space="preserve"> </w:t>
+      </w:r>
+      <w:proofErr w:type="spellStart"/>
+      <w:r>
+        <w:rPr>
+          <w:rFonts w:eastAsiaTheme="majorEastAsia"/>
+          <w:lang w:val="en-ID"/>
+        </w:rPr>
+        <w:t>secara</w:t>
+      </w:r>
+      <w:proofErr w:type="spellEnd"/>
+      <w:r>
+        <w:rPr>
+          <w:rFonts w:eastAsiaTheme="majorEastAsia"/>
+          <w:lang w:val="en-ID"/>
+        </w:rPr>
+        <w:t xml:space="preserve"> </w:t>
+      </w:r>
+      <w:proofErr w:type="spellStart"/>
+      <w:r>
+        <w:rPr>
+          <w:rFonts w:eastAsiaTheme="majorEastAsia"/>
+          <w:lang w:val="en-ID"/>
+        </w:rPr>
+        <w:t>seimbang</w:t>
+      </w:r>
+      <w:proofErr w:type="spellEnd"/>
+      <w:r>
+        <w:rPr>
+          <w:rFonts w:eastAsiaTheme="majorEastAsia"/>
+          <w:lang w:val="en-ID"/>
+        </w:rPr>
+        <w:t xml:space="preserve"> (Round-Robin) </w:t>
+      </w:r>
+      <w:proofErr w:type="spellStart"/>
+      <w:r>
+        <w:rPr>
+          <w:rFonts w:eastAsiaTheme="majorEastAsia"/>
+          <w:lang w:val="en-ID"/>
+        </w:rPr>
+        <w:t>bergantian</w:t>
+      </w:r>
+      <w:proofErr w:type="spellEnd"/>
+      <w:r>
+        <w:rPr>
+          <w:rFonts w:eastAsiaTheme="majorEastAsia"/>
+          <w:lang w:val="en-ID"/>
+        </w:rPr>
+        <w:t xml:space="preserve"> </w:t>
+      </w:r>
+      <w:proofErr w:type="spellStart"/>
+      <w:r>
+        <w:rPr>
+          <w:rFonts w:eastAsiaTheme="majorEastAsia"/>
+          <w:lang w:val="en-ID"/>
+        </w:rPr>
+        <w:t>antara</w:t>
+      </w:r>
+      <w:proofErr w:type="spellEnd"/>
+      <w:r>
+        <w:rPr>
+          <w:rFonts w:eastAsiaTheme="majorEastAsia"/>
+          <w:lang w:val="en-ID"/>
+        </w:rPr>
+        <w:t xml:space="preserve"> Worker 1 dan Worker 2.</w:t>
+      </w:r>
+    </w:p>
+    <w:p>
+      <w:pPr>
+        <w:pStyle w:val="ListParagraph"/>
+        <w:numPr>
+          <w:ilvl w:val="0"/>
+          <w:numId w:val="14"/>
+        </w:numPr>
+        <w:rPr>
+          <w:rFonts w:eastAsiaTheme="majorEastAsia"/>
+          <w:lang w:val="en-ID"/>
+        </w:rPr>
+      </w:pPr>
+      <w:proofErr w:type="spellStart"/>
+      <w:r>
+        <w:rPr>
+          <w:rFonts w:eastAsiaTheme="majorEastAsia"/>
+          <w:lang w:val="en-ID"/>
+        </w:rPr>
+        <w:lastRenderedPageBreak/>
+        <w:t>Mekanisme</w:t>
+      </w:r>
+      <w:proofErr w:type="spellEnd"/>
+      <w:r>
+        <w:rPr>
+          <w:rFonts w:eastAsiaTheme="majorEastAsia"/>
+          <w:lang w:val="en-ID"/>
+        </w:rPr>
+        <w:t xml:space="preserve"> Rate Limiting Kong dan Redis </w:t>
+      </w:r>
+      <w:proofErr w:type="spellStart"/>
+      <w:r>
+        <w:rPr>
+          <w:rFonts w:eastAsiaTheme="majorEastAsia"/>
+          <w:lang w:val="en-ID"/>
+        </w:rPr>
+        <w:t>berhasil</w:t>
+      </w:r>
+      <w:proofErr w:type="spellEnd"/>
+      <w:r>
+        <w:rPr>
+          <w:rFonts w:eastAsiaTheme="majorEastAsia"/>
+          <w:lang w:val="en-ID"/>
+        </w:rPr>
+        <w:t xml:space="preserve"> </w:t>
+      </w:r>
+      <w:proofErr w:type="spellStart"/>
+      <w:r>
+        <w:rPr>
+          <w:rFonts w:eastAsiaTheme="majorEastAsia"/>
+          <w:lang w:val="en-ID"/>
+        </w:rPr>
+        <w:t>menolak</w:t>
+      </w:r>
+      <w:proofErr w:type="spellEnd"/>
+      <w:r>
+        <w:rPr>
+          <w:rFonts w:eastAsiaTheme="majorEastAsia"/>
+          <w:lang w:val="en-ID"/>
+        </w:rPr>
+        <w:t xml:space="preserve"> request yang </w:t>
+      </w:r>
+      <w:proofErr w:type="spellStart"/>
+      <w:r>
+        <w:rPr>
+          <w:rFonts w:eastAsiaTheme="majorEastAsia"/>
+          <w:lang w:val="en-ID"/>
+        </w:rPr>
+        <w:t>melampaui</w:t>
+      </w:r>
+      <w:proofErr w:type="spellEnd"/>
+      <w:r>
+        <w:rPr>
+          <w:rFonts w:eastAsiaTheme="majorEastAsia"/>
+          <w:lang w:val="en-ID"/>
+        </w:rPr>
+        <w:t xml:space="preserve"> </w:t>
+      </w:r>
+      <w:proofErr w:type="spellStart"/>
+      <w:r>
+        <w:rPr>
+          <w:rFonts w:eastAsiaTheme="majorEastAsia"/>
+          <w:lang w:val="en-ID"/>
+        </w:rPr>
+        <w:t>kuota</w:t>
+      </w:r>
+      <w:proofErr w:type="spellEnd"/>
+      <w:r>
+        <w:rPr>
+          <w:rFonts w:eastAsiaTheme="majorEastAsia"/>
+          <w:lang w:val="en-ID"/>
+        </w:rPr>
+        <w:t xml:space="preserve"> </w:t>
+      </w:r>
+      <w:proofErr w:type="spellStart"/>
+      <w:r>
+        <w:rPr>
+          <w:rFonts w:eastAsiaTheme="majorEastAsia"/>
+          <w:lang w:val="en-ID"/>
+        </w:rPr>
+        <w:t>dengan</w:t>
+      </w:r>
+      <w:proofErr w:type="spellEnd"/>
+      <w:r>
+        <w:rPr>
+          <w:rFonts w:eastAsiaTheme="majorEastAsia"/>
+          <w:lang w:val="en-ID"/>
+        </w:rPr>
+        <w:t xml:space="preserve"> </w:t>
+      </w:r>
+      <w:proofErr w:type="spellStart"/>
+      <w:r>
+        <w:rPr>
+          <w:rFonts w:eastAsiaTheme="majorEastAsia"/>
+          <w:lang w:val="en-ID"/>
+        </w:rPr>
+        <w:t>kode</w:t>
+      </w:r>
+      <w:proofErr w:type="spellEnd"/>
+      <w:r>
+        <w:rPr>
+          <w:rFonts w:eastAsiaTheme="majorEastAsia"/>
+          <w:lang w:val="en-ID"/>
+        </w:rPr>
+        <w:t xml:space="preserve"> status HTTP 429 Too Many Requests.</w:t>
+      </w:r>
     </w:p>
     <w:p>
       <w:pPr>
@@ -2338,11 +4413,19 @@
         </w:rPr>
         <w:t xml:space="preserve">5.1 </w:t>
       </w:r>
-      <w:r>
-        <w:rPr>
-          <w:lang w:val="en-ID"/>
-        </w:rPr>
-        <w:t>Skenario 1: Traffic Rate Limiting (1.000 Virtual Users)</w:t>
+      <w:proofErr w:type="spellStart"/>
+      <w:r>
+        <w:rPr>
+          <w:lang w:val="en-ID"/>
+        </w:rPr>
+        <w:t>Skenario</w:t>
+      </w:r>
+      <w:proofErr w:type="spellEnd"/>
+      <w:r>
+        <w:rPr>
+          <w:lang w:val="en-ID"/>
+        </w:rPr>
+        <w:t xml:space="preserve"> 1: Traffic Rate Limiting (1.000 Virtual Users)</w:t>
       </w:r>
     </w:p>
     <w:p>
@@ -2362,7 +4445,167 @@
           <w:rFonts w:eastAsiaTheme="majorEastAsia"/>
           <w:lang w:val="en-ID"/>
         </w:rPr>
-        <w:t>Tujuan: Menguji elastisitas Gateway dalam mempertahankan ketersediaan layanan saat diserbu trafik masif.</w:t>
+        <w:t xml:space="preserve">Tujuan: </w:t>
+      </w:r>
+      <w:proofErr w:type="spellStart"/>
+      <w:r>
+        <w:rPr>
+          <w:rFonts w:eastAsiaTheme="majorEastAsia"/>
+          <w:lang w:val="en-ID"/>
+        </w:rPr>
+        <w:t>Menguji</w:t>
+      </w:r>
+      <w:proofErr w:type="spellEnd"/>
+      <w:r>
+        <w:rPr>
+          <w:rFonts w:eastAsiaTheme="majorEastAsia"/>
+          <w:lang w:val="en-ID"/>
+        </w:rPr>
+        <w:t xml:space="preserve"> </w:t>
+      </w:r>
+      <w:proofErr w:type="spellStart"/>
+      <w:r>
+        <w:rPr>
+          <w:rFonts w:eastAsiaTheme="majorEastAsia"/>
+          <w:lang w:val="en-ID"/>
+        </w:rPr>
+        <w:t>elastisitas</w:t>
+      </w:r>
+      <w:proofErr w:type="spellEnd"/>
+      <w:r>
+        <w:rPr>
+          <w:rFonts w:eastAsiaTheme="majorEastAsia"/>
+          <w:lang w:val="en-ID"/>
+        </w:rPr>
+        <w:t xml:space="preserve"> Gateway </w:t>
+      </w:r>
+      <w:proofErr w:type="spellStart"/>
+      <w:r>
+        <w:rPr>
+          <w:rFonts w:eastAsiaTheme="majorEastAsia"/>
+          <w:lang w:val="en-ID"/>
+        </w:rPr>
+        <w:t>dalam</w:t>
+      </w:r>
+      <w:proofErr w:type="spellEnd"/>
+      <w:r>
+        <w:rPr>
+          <w:rFonts w:eastAsiaTheme="majorEastAsia"/>
+          <w:lang w:val="en-ID"/>
+        </w:rPr>
+        <w:t xml:space="preserve"> </w:t>
+      </w:r>
+      <w:proofErr w:type="spellStart"/>
+      <w:r>
+        <w:rPr>
+          <w:rFonts w:eastAsiaTheme="majorEastAsia"/>
+          <w:lang w:val="en-ID"/>
+        </w:rPr>
+        <w:t>mempertahankan</w:t>
+      </w:r>
+      <w:proofErr w:type="spellEnd"/>
+      <w:r>
+        <w:rPr>
+          <w:rFonts w:eastAsiaTheme="majorEastAsia"/>
+          <w:lang w:val="en-ID"/>
+        </w:rPr>
+        <w:t xml:space="preserve"> </w:t>
+      </w:r>
+      <w:proofErr w:type="spellStart"/>
+      <w:r>
+        <w:rPr>
+          <w:rFonts w:eastAsiaTheme="majorEastAsia"/>
+          <w:lang w:val="en-ID"/>
+        </w:rPr>
+        <w:t>ketersediaan</w:t>
+      </w:r>
+      <w:proofErr w:type="spellEnd"/>
+      <w:r>
+        <w:rPr>
+          <w:rFonts w:eastAsiaTheme="majorEastAsia"/>
+          <w:lang w:val="en-ID"/>
+        </w:rPr>
+        <w:t xml:space="preserve"> </w:t>
+      </w:r>
+      <w:proofErr w:type="spellStart"/>
+      <w:r>
+        <w:rPr>
+          <w:rFonts w:eastAsiaTheme="majorEastAsia"/>
+          <w:lang w:val="en-ID"/>
+        </w:rPr>
+        <w:t>layanan</w:t>
+      </w:r>
+      <w:proofErr w:type="spellEnd"/>
+      <w:r>
+        <w:rPr>
+          <w:rFonts w:eastAsiaTheme="majorEastAsia"/>
+          <w:lang w:val="en-ID"/>
+        </w:rPr>
+        <w:t xml:space="preserve"> </w:t>
+      </w:r>
+      <w:proofErr w:type="spellStart"/>
+      <w:r>
+        <w:rPr>
+          <w:rFonts w:eastAsiaTheme="majorEastAsia"/>
+          <w:lang w:val="en-ID"/>
+        </w:rPr>
+        <w:t>saat</w:t>
+      </w:r>
+      <w:proofErr w:type="spellEnd"/>
+      <w:r>
+        <w:rPr>
+          <w:rFonts w:eastAsiaTheme="majorEastAsia"/>
+          <w:lang w:val="en-ID"/>
+        </w:rPr>
+        <w:t xml:space="preserve"> </w:t>
+      </w:r>
+      <w:proofErr w:type="spellStart"/>
+      <w:r>
+        <w:rPr>
+          <w:rFonts w:eastAsiaTheme="majorEastAsia"/>
+          <w:lang w:val="en-ID"/>
+        </w:rPr>
+        <w:t>diserbu</w:t>
+      </w:r>
+      <w:proofErr w:type="spellEnd"/>
+      <w:r>
+        <w:rPr>
+          <w:rFonts w:eastAsiaTheme="majorEastAsia"/>
+          <w:lang w:val="en-ID"/>
+        </w:rPr>
+        <w:t xml:space="preserve"> </w:t>
+      </w:r>
+      <w:proofErr w:type="spellStart"/>
+      <w:r>
+        <w:rPr>
+          <w:rFonts w:eastAsiaTheme="majorEastAsia"/>
+          <w:lang w:val="en-ID"/>
+        </w:rPr>
+        <w:t>trafik</w:t>
+      </w:r>
+      <w:proofErr w:type="spellEnd"/>
+      <w:r>
+        <w:rPr>
+          <w:rFonts w:eastAsiaTheme="majorEastAsia"/>
+          <w:lang w:val="en-ID"/>
+        </w:rPr>
+        <w:t xml:space="preserve"> </w:t>
+      </w:r>
+      <w:proofErr w:type="spellStart"/>
+      <w:r>
+        <w:rPr>
+          <w:rFonts w:eastAsiaTheme="majorEastAsia"/>
+          <w:lang w:val="en-ID"/>
+        </w:rPr>
+        <w:t>masif</w:t>
+      </w:r>
+      <w:proofErr w:type="spellEnd"/>
+      <w:r>
+        <w:rPr>
+          <w:rFonts w:eastAsiaTheme="majorEastAsia"/>
+          <w:lang w:val="en-ID"/>
+        </w:rPr>
+        <w:t>.</w:t>
       </w:r>
     </w:p>
     <w:p>
@@ -2418,12 +4661,21 @@
           <w:lang w:val="en-ID"/>
         </w:rPr>
       </w:pPr>
-      <w:r>
-        <w:rPr>
-          <w:rFonts w:eastAsiaTheme="majorEastAsia"/>
-          <w:lang w:val="en-ID"/>
-        </w:rPr>
-        <w:t>Kriteria Keberhasilan:</w:t>
+      <w:proofErr w:type="spellStart"/>
+      <w:r>
+        <w:rPr>
+          <w:rFonts w:eastAsiaTheme="majorEastAsia"/>
+          <w:lang w:val="en-ID"/>
+        </w:rPr>
+        <w:t>Kriteria</w:t>
+      </w:r>
+      <w:proofErr w:type="spellEnd"/>
+      <w:r>
+        <w:rPr>
+          <w:rFonts w:eastAsiaTheme="majorEastAsia"/>
+          <w:lang w:val="en-ID"/>
+        </w:rPr>
+        <w:t xml:space="preserve"> Keberhasilan:</w:t>
       </w:r>
     </w:p>
     <w:p>
@@ -2443,7 +4695,87 @@
           <w:rFonts w:eastAsiaTheme="majorEastAsia"/>
           <w:lang w:val="en-ID"/>
         </w:rPr>
-        <w:t>Gateway menolak request yang melampaui kuota dengan kode HTTP 429 Too Many Requests.</w:t>
+        <w:t xml:space="preserve">Gateway </w:t>
+      </w:r>
+      <w:proofErr w:type="spellStart"/>
+      <w:r>
+        <w:rPr>
+          <w:rFonts w:eastAsiaTheme="majorEastAsia"/>
+          <w:lang w:val="en-ID"/>
+        </w:rPr>
+        <w:t>menolak</w:t>
+      </w:r>
+      <w:proofErr w:type="spellEnd"/>
+      <w:r>
+        <w:rPr>
+          <w:rFonts w:eastAsiaTheme="majorEastAsia"/>
+          <w:lang w:val="en-ID"/>
+        </w:rPr>
+        <w:t xml:space="preserve"> request yang </w:t>
+      </w:r>
+      <w:proofErr w:type="spellStart"/>
+      <w:r>
+        <w:rPr>
+          <w:rFonts w:eastAsiaTheme="majorEastAsia"/>
+          <w:lang w:val="en-ID"/>
+        </w:rPr>
+        <w:t>melampaui</w:t>
+      </w:r>
+      <w:proofErr w:type="spellEnd"/>
+      <w:r>
+        <w:rPr>
+          <w:rFonts w:eastAsiaTheme="majorEastAsia"/>
+          <w:lang w:val="en-ID"/>
+        </w:rPr>
+        <w:t xml:space="preserve"> </w:t>
+      </w:r>
+      <w:proofErr w:type="spellStart"/>
+      <w:r>
+        <w:rPr>
+          <w:rFonts w:eastAsiaTheme="majorEastAsia"/>
+          <w:lang w:val="en-ID"/>
+        </w:rPr>
+        <w:t>kuota</w:t>
+      </w:r>
+      <w:proofErr w:type="spellEnd"/>
+      <w:r>
+        <w:rPr>
+          <w:rFonts w:eastAsiaTheme="majorEastAsia"/>
+          <w:lang w:val="en-ID"/>
+        </w:rPr>
+        <w:t xml:space="preserve"> </w:t>
+      </w:r>
+      <w:proofErr w:type="spellStart"/>
+      <w:r>
+        <w:rPr>
+          <w:rFonts w:eastAsiaTheme="majorEastAsia"/>
+          <w:lang w:val="en-ID"/>
+        </w:rPr>
+        <w:t>dengan</w:t>
+      </w:r>
+      <w:proofErr w:type="spellEnd"/>
+      <w:r>
+        <w:rPr>
+          <w:rFonts w:eastAsiaTheme="majorEastAsia"/>
+          <w:lang w:val="en-ID"/>
+        </w:rPr>
+        <w:t xml:space="preserve"> </w:t>
+      </w:r>
+      <w:proofErr w:type="spellStart"/>
+      <w:r>
+        <w:rPr>
+          <w:rFonts w:eastAsiaTheme="majorEastAsia"/>
+          <w:lang w:val="en-ID"/>
+        </w:rPr>
+        <w:t>kode</w:t>
+      </w:r>
+      <w:proofErr w:type="spellEnd"/>
+      <w:r>
+        <w:rPr>
+          <w:rFonts w:eastAsiaTheme="majorEastAsia"/>
+          <w:lang w:val="en-ID"/>
+        </w:rPr>
+        <w:t xml:space="preserve"> HTTP 429 Too Many Requests.</w:t>
       </w:r>
     </w:p>
     <w:p>
@@ -2463,7 +4795,71 @@
           <w:rFonts w:eastAsiaTheme="majorEastAsia"/>
           <w:lang w:val="en-ID"/>
         </w:rPr>
-        <w:t>Header X-RateLimit-Remaining-Second terkirim dengan presisi.</w:t>
+        <w:t>Header X-</w:t>
+      </w:r>
+      <w:proofErr w:type="spellStart"/>
+      <w:r>
+        <w:rPr>
+          <w:rFonts w:eastAsiaTheme="majorEastAsia"/>
+          <w:lang w:val="en-ID"/>
+        </w:rPr>
+        <w:t>RateLimit</w:t>
+      </w:r>
+      <w:proofErr w:type="spellEnd"/>
+      <w:r>
+        <w:rPr>
+          <w:rFonts w:eastAsiaTheme="majorEastAsia"/>
+          <w:lang w:val="en-ID"/>
+        </w:rPr>
+        <w:t xml:space="preserve">-Remaining-Second </w:t>
+      </w:r>
+      <w:proofErr w:type="spellStart"/>
+      <w:r>
+        <w:rPr>
+          <w:rFonts w:eastAsiaTheme="majorEastAsia"/>
+          <w:lang w:val="en-ID"/>
+        </w:rPr>
+        <w:t>terkirim</w:t>
+      </w:r>
+      <w:proofErr w:type="spellEnd"/>
+      <w:r>
+        <w:rPr>
+          <w:rFonts w:eastAsiaTheme="majorEastAsia"/>
+          <w:lang w:val="en-ID"/>
+        </w:rPr>
+        <w:t xml:space="preserve"> </w:t>
+      </w:r>
+      <w:proofErr w:type="spellStart"/>
+      <w:r>
+        <w:rPr>
+          <w:rFonts w:eastAsiaTheme="majorEastAsia"/>
+          <w:lang w:val="en-ID"/>
+        </w:rPr>
+        <w:t>dengan</w:t>
+      </w:r>
+      <w:proofErr w:type="spellEnd"/>
+      <w:r>
+        <w:rPr>
+          <w:rFonts w:eastAsiaTheme="majorEastAsia"/>
+          <w:lang w:val="en-ID"/>
+        </w:rPr>
+        <w:t xml:space="preserve"> </w:t>
+      </w:r>
+      <w:proofErr w:type="spellStart"/>
+      <w:r>
+        <w:rPr>
+          <w:rFonts w:eastAsiaTheme="majorEastAsia"/>
+          <w:lang w:val="en-ID"/>
+        </w:rPr>
+        <w:t>presisi</w:t>
+      </w:r>
+      <w:proofErr w:type="spellEnd"/>
+      <w:r>
+        <w:rPr>
+          <w:rFonts w:eastAsiaTheme="majorEastAsia"/>
+          <w:lang w:val="en-ID"/>
+        </w:rPr>
+        <w:t>.</w:t>
       </w:r>
     </w:p>
     <w:p>
@@ -2483,14 +4879,87 @@
           <w:rFonts w:eastAsiaTheme="majorEastAsia"/>
           <w:lang w:val="en-ID"/>
         </w:rPr>
-        <w:t>Latency untuk request yang berhasil tetap stabil</w:t>
-      </w:r>
-      <w:r>
-        <w:rPr>
-          <w:rFonts w:eastAsiaTheme="majorEastAsia"/>
-          <w:lang w:val="en-ID"/>
-        </w:rPr>
-        <w:t xml:space="preserve"> dibawah 200ms</w:t>
+        <w:t xml:space="preserve">Latency </w:t>
+      </w:r>
+      <w:proofErr w:type="spellStart"/>
+      <w:r>
+        <w:rPr>
+          <w:rFonts w:eastAsiaTheme="majorEastAsia"/>
+          <w:lang w:val="en-ID"/>
+        </w:rPr>
+        <w:t>untuk</w:t>
+      </w:r>
+      <w:proofErr w:type="spellEnd"/>
+      <w:r>
+        <w:rPr>
+          <w:rFonts w:eastAsiaTheme="majorEastAsia"/>
+          <w:lang w:val="en-ID"/>
+        </w:rPr>
+        <w:t xml:space="preserve"> request yang </w:t>
+      </w:r>
+      <w:proofErr w:type="spellStart"/>
+      <w:r>
+        <w:rPr>
+          <w:rFonts w:eastAsiaTheme="majorEastAsia"/>
+          <w:lang w:val="en-ID"/>
+        </w:rPr>
+        <w:t>berhasil</w:t>
+      </w:r>
+      <w:proofErr w:type="spellEnd"/>
+      <w:r>
+        <w:rPr>
+          <w:rFonts w:eastAsiaTheme="majorEastAsia"/>
+          <w:lang w:val="en-ID"/>
+        </w:rPr>
+        <w:t xml:space="preserve"> </w:t>
+      </w:r>
+      <w:proofErr w:type="spellStart"/>
+      <w:r>
+        <w:rPr>
+          <w:rFonts w:eastAsiaTheme="majorEastAsia"/>
+          <w:lang w:val="en-ID"/>
+        </w:rPr>
+        <w:t>tetap</w:t>
+      </w:r>
+      <w:proofErr w:type="spellEnd"/>
+      <w:r>
+        <w:rPr>
+          <w:rFonts w:eastAsiaTheme="majorEastAsia"/>
+          <w:lang w:val="en-ID"/>
+        </w:rPr>
+        <w:t xml:space="preserve"> </w:t>
+      </w:r>
+      <w:proofErr w:type="spellStart"/>
+      <w:r>
+        <w:rPr>
+          <w:rFonts w:eastAsiaTheme="majorEastAsia"/>
+          <w:lang w:val="en-ID"/>
+        </w:rPr>
+        <w:t>stabil</w:t>
+      </w:r>
+      <w:proofErr w:type="spellEnd"/>
+      <w:r>
+        <w:rPr>
+          <w:rFonts w:eastAsiaTheme="majorEastAsia"/>
+          <w:lang w:val="en-ID"/>
+        </w:rPr>
+        <w:t xml:space="preserve"> </w:t>
+      </w:r>
+      <w:proofErr w:type="spellStart"/>
+      <w:r>
+        <w:rPr>
+          <w:rFonts w:eastAsiaTheme="majorEastAsia"/>
+          <w:lang w:val="en-ID"/>
+        </w:rPr>
+        <w:t>dibawah</w:t>
+      </w:r>
+      <w:proofErr w:type="spellEnd"/>
+      <w:r>
+        <w:rPr>
+          <w:rFonts w:eastAsiaTheme="majorEastAsia"/>
+          <w:lang w:val="en-ID"/>
+        </w:rPr>
+        <w:t xml:space="preserve"> 200ms</w:t>
       </w:r>
       <w:r>
         <w:rPr>
@@ -2550,11 +5019,19 @@
         </w:rPr>
         <w:t xml:space="preserve">5.2 </w:t>
       </w:r>
-      <w:r>
-        <w:rPr>
-          <w:lang w:val="en-ID"/>
-        </w:rPr>
-        <w:t>Skenario 2: Disaster Recovery &amp; Circuit Breaker (Live Demo)</w:t>
+      <w:proofErr w:type="spellStart"/>
+      <w:r>
+        <w:rPr>
+          <w:lang w:val="en-ID"/>
+        </w:rPr>
+        <w:t>Skenario</w:t>
+      </w:r>
+      <w:proofErr w:type="spellEnd"/>
+      <w:r>
+        <w:rPr>
+          <w:lang w:val="en-ID"/>
+        </w:rPr>
+        <w:t xml:space="preserve"> 2: Disaster Recovery &amp; Circuit Breaker (Live Demo)</w:t>
       </w:r>
     </w:p>
     <w:p>
@@ -2574,7 +5051,55 @@
           <w:rFonts w:eastAsiaTheme="majorEastAsia"/>
           <w:lang w:val="en-ID"/>
         </w:rPr>
-        <w:t>Tujuan: Membuktikan isolasi kegagalan (</w:t>
+        <w:t xml:space="preserve">Tujuan: </w:t>
+      </w:r>
+      <w:proofErr w:type="spellStart"/>
+      <w:r>
+        <w:rPr>
+          <w:rFonts w:eastAsiaTheme="majorEastAsia"/>
+          <w:lang w:val="en-ID"/>
+        </w:rPr>
+        <w:t>Membuktikan</w:t>
+      </w:r>
+      <w:proofErr w:type="spellEnd"/>
+      <w:r>
+        <w:rPr>
+          <w:rFonts w:eastAsiaTheme="majorEastAsia"/>
+          <w:lang w:val="en-ID"/>
+        </w:rPr>
+        <w:t xml:space="preserve"> </w:t>
+      </w:r>
+      <w:proofErr w:type="spellStart"/>
+      <w:r>
+        <w:rPr>
+          <w:rFonts w:eastAsiaTheme="majorEastAsia"/>
+          <w:lang w:val="en-ID"/>
+        </w:rPr>
+        <w:t>isolasi</w:t>
+      </w:r>
+      <w:proofErr w:type="spellEnd"/>
+      <w:r>
+        <w:rPr>
+          <w:rFonts w:eastAsiaTheme="majorEastAsia"/>
+          <w:lang w:val="en-ID"/>
+        </w:rPr>
+        <w:t xml:space="preserve"> </w:t>
+      </w:r>
+      <w:proofErr w:type="spellStart"/>
+      <w:r>
+        <w:rPr>
+          <w:rFonts w:eastAsiaTheme="majorEastAsia"/>
+          <w:lang w:val="en-ID"/>
+        </w:rPr>
+        <w:t>kegagalan</w:t>
+      </w:r>
+      <w:proofErr w:type="spellEnd"/>
+      <w:r>
+        <w:rPr>
+          <w:rFonts w:eastAsiaTheme="majorEastAsia"/>
+          <w:lang w:val="en-ID"/>
+        </w:rPr>
+        <w:t xml:space="preserve"> (</w:t>
       </w:r>
       <w:r>
         <w:rPr>
@@ -2590,7 +5115,71 @@
           <w:rFonts w:eastAsiaTheme="majorEastAsia"/>
           <w:lang w:val="en-ID"/>
         </w:rPr>
-        <w:t>) saat satu layanan mengalami crash.</w:t>
+        <w:t xml:space="preserve">) </w:t>
+      </w:r>
+      <w:proofErr w:type="spellStart"/>
+      <w:r>
+        <w:rPr>
+          <w:rFonts w:eastAsiaTheme="majorEastAsia"/>
+          <w:lang w:val="en-ID"/>
+        </w:rPr>
+        <w:t>saat</w:t>
+      </w:r>
+      <w:proofErr w:type="spellEnd"/>
+      <w:r>
+        <w:rPr>
+          <w:rFonts w:eastAsiaTheme="majorEastAsia"/>
+          <w:lang w:val="en-ID"/>
+        </w:rPr>
+        <w:t xml:space="preserve"> </w:t>
+      </w:r>
+      <w:proofErr w:type="spellStart"/>
+      <w:r>
+        <w:rPr>
+          <w:rFonts w:eastAsiaTheme="majorEastAsia"/>
+          <w:lang w:val="en-ID"/>
+        </w:rPr>
+        <w:t>satu</w:t>
+      </w:r>
+      <w:proofErr w:type="spellEnd"/>
+      <w:r>
+        <w:rPr>
+          <w:rFonts w:eastAsiaTheme="majorEastAsia"/>
+          <w:lang w:val="en-ID"/>
+        </w:rPr>
+        <w:t xml:space="preserve"> </w:t>
+      </w:r>
+      <w:proofErr w:type="spellStart"/>
+      <w:r>
+        <w:rPr>
+          <w:rFonts w:eastAsiaTheme="majorEastAsia"/>
+          <w:lang w:val="en-ID"/>
+        </w:rPr>
+        <w:t>layanan</w:t>
+      </w:r>
+      <w:proofErr w:type="spellEnd"/>
+      <w:r>
+        <w:rPr>
+          <w:rFonts w:eastAsiaTheme="majorEastAsia"/>
+          <w:lang w:val="en-ID"/>
+        </w:rPr>
+        <w:t xml:space="preserve"> </w:t>
+      </w:r>
+      <w:proofErr w:type="spellStart"/>
+      <w:r>
+        <w:rPr>
+          <w:rFonts w:eastAsiaTheme="majorEastAsia"/>
+          <w:lang w:val="en-ID"/>
+        </w:rPr>
+        <w:t>mengalami</w:t>
+      </w:r>
+      <w:proofErr w:type="spellEnd"/>
+      <w:r>
+        <w:rPr>
+          <w:rFonts w:eastAsiaTheme="majorEastAsia"/>
+          <w:lang w:val="en-ID"/>
+        </w:rPr>
+        <w:t xml:space="preserve"> crash.</w:t>
       </w:r>
     </w:p>
     <w:p>
@@ -2610,7 +5199,119 @@
           <w:rFonts w:eastAsiaTheme="majorEastAsia"/>
           <w:lang w:val="en-ID"/>
         </w:rPr>
-        <w:t>Metode: Menjalankan perintah docker stop service-pajak di tengah pengujian beban aktif.</w:t>
+        <w:t xml:space="preserve">Metode: </w:t>
+      </w:r>
+      <w:proofErr w:type="spellStart"/>
+      <w:r>
+        <w:rPr>
+          <w:rFonts w:eastAsiaTheme="majorEastAsia"/>
+          <w:lang w:val="en-ID"/>
+        </w:rPr>
+        <w:t>Menjalankan</w:t>
+      </w:r>
+      <w:proofErr w:type="spellEnd"/>
+      <w:r>
+        <w:rPr>
+          <w:rFonts w:eastAsiaTheme="majorEastAsia"/>
+          <w:lang w:val="en-ID"/>
+        </w:rPr>
+        <w:t xml:space="preserve"> </w:t>
+      </w:r>
+      <w:proofErr w:type="spellStart"/>
+      <w:r>
+        <w:rPr>
+          <w:rFonts w:eastAsiaTheme="majorEastAsia"/>
+          <w:lang w:val="en-ID"/>
+        </w:rPr>
+        <w:t>perintah</w:t>
+      </w:r>
+      <w:proofErr w:type="spellEnd"/>
+      <w:r>
+        <w:rPr>
+          <w:rFonts w:eastAsiaTheme="majorEastAsia"/>
+          <w:lang w:val="en-ID"/>
+        </w:rPr>
+        <w:t xml:space="preserve"> docker stop service-</w:t>
+      </w:r>
+      <w:proofErr w:type="spellStart"/>
+      <w:r>
+        <w:rPr>
+          <w:rFonts w:eastAsiaTheme="majorEastAsia"/>
+          <w:lang w:val="en-ID"/>
+        </w:rPr>
+        <w:t>pajak</w:t>
+      </w:r>
+      <w:proofErr w:type="spellEnd"/>
+      <w:r>
+        <w:rPr>
+          <w:rFonts w:eastAsiaTheme="majorEastAsia"/>
+          <w:lang w:val="en-ID"/>
+        </w:rPr>
+        <w:t xml:space="preserve"> di </w:t>
+      </w:r>
+      <w:proofErr w:type="spellStart"/>
+      <w:r>
+        <w:rPr>
+          <w:rFonts w:eastAsiaTheme="majorEastAsia"/>
+          <w:lang w:val="en-ID"/>
+        </w:rPr>
+        <w:t>tengah</w:t>
+      </w:r>
+      <w:proofErr w:type="spellEnd"/>
+      <w:r>
+        <w:rPr>
+          <w:rFonts w:eastAsiaTheme="majorEastAsia"/>
+          <w:lang w:val="en-ID"/>
+        </w:rPr>
+        <w:t xml:space="preserve"> </w:t>
+      </w:r>
+      <w:proofErr w:type="spellStart"/>
+      <w:r>
+        <w:rPr>
+          <w:rFonts w:eastAsiaTheme="majorEastAsia"/>
+          <w:lang w:val="en-ID"/>
+        </w:rPr>
+        <w:t>pengujian</w:t>
+      </w:r>
+      <w:proofErr w:type="spellEnd"/>
+      <w:r>
+        <w:rPr>
+          <w:rFonts w:eastAsiaTheme="majorEastAsia"/>
+          <w:lang w:val="en-ID"/>
+        </w:rPr>
+        <w:t xml:space="preserve"> </w:t>
+      </w:r>
+      <w:proofErr w:type="spellStart"/>
+      <w:r>
+        <w:rPr>
+          <w:rFonts w:eastAsiaTheme="majorEastAsia"/>
+          <w:lang w:val="en-ID"/>
+        </w:rPr>
+        <w:t>beban</w:t>
+      </w:r>
+      <w:proofErr w:type="spellEnd"/>
+      <w:r>
+        <w:rPr>
+          <w:rFonts w:eastAsiaTheme="majorEastAsia"/>
+          <w:lang w:val="en-ID"/>
+        </w:rPr>
+        <w:t xml:space="preserve"> </w:t>
+      </w:r>
+      <w:proofErr w:type="spellStart"/>
+      <w:r>
+        <w:rPr>
+          <w:rFonts w:eastAsiaTheme="majorEastAsia"/>
+          <w:lang w:val="en-ID"/>
+        </w:rPr>
+        <w:t>aktif</w:t>
+      </w:r>
+      <w:proofErr w:type="spellEnd"/>
+      <w:r>
+        <w:rPr>
+          <w:rFonts w:eastAsiaTheme="majorEastAsia"/>
+          <w:lang w:val="en-ID"/>
+        </w:rPr>
+        <w:t>.</w:t>
       </w:r>
     </w:p>
     <w:p>
@@ -2625,12 +5326,21 @@
           <w:lang w:val="en-ID"/>
         </w:rPr>
       </w:pPr>
-      <w:r>
-        <w:rPr>
-          <w:rFonts w:eastAsiaTheme="majorEastAsia"/>
-          <w:lang w:val="en-ID"/>
-        </w:rPr>
-        <w:t>Kriteria Keberhasilan:</w:t>
+      <w:proofErr w:type="spellStart"/>
+      <w:r>
+        <w:rPr>
+          <w:rFonts w:eastAsiaTheme="majorEastAsia"/>
+          <w:lang w:val="en-ID"/>
+        </w:rPr>
+        <w:t>Kriteria</w:t>
+      </w:r>
+      <w:proofErr w:type="spellEnd"/>
+      <w:r>
+        <w:rPr>
+          <w:rFonts w:eastAsiaTheme="majorEastAsia"/>
+          <w:lang w:val="en-ID"/>
+        </w:rPr>
+        <w:t xml:space="preserve"> Keberhasilan:</w:t>
       </w:r>
     </w:p>
     <w:p>
@@ -2650,7 +5360,199 @@
           <w:rFonts w:eastAsiaTheme="majorEastAsia"/>
           <w:lang w:val="en-ID"/>
         </w:rPr>
-        <w:t>Kong Gateway secara instan memutus koneksi dan mengembalikan respons HTTP 503 Service Unavailable untuk rute /api/v1/pajak tanpa timeout (RTO = 0 detik).</w:t>
+        <w:t xml:space="preserve">Kong Gateway </w:t>
+      </w:r>
+      <w:proofErr w:type="spellStart"/>
+      <w:r>
+        <w:rPr>
+          <w:rFonts w:eastAsiaTheme="majorEastAsia"/>
+          <w:lang w:val="en-ID"/>
+        </w:rPr>
+        <w:t>secara</w:t>
+      </w:r>
+      <w:proofErr w:type="spellEnd"/>
+      <w:r>
+        <w:rPr>
+          <w:rFonts w:eastAsiaTheme="majorEastAsia"/>
+          <w:lang w:val="en-ID"/>
+        </w:rPr>
+        <w:t xml:space="preserve"> </w:t>
+      </w:r>
+      <w:proofErr w:type="spellStart"/>
+      <w:r>
+        <w:rPr>
+          <w:rFonts w:eastAsiaTheme="majorEastAsia"/>
+          <w:lang w:val="en-ID"/>
+        </w:rPr>
+        <w:t>instan</w:t>
+      </w:r>
+      <w:proofErr w:type="spellEnd"/>
+      <w:r>
+        <w:rPr>
+          <w:rFonts w:eastAsiaTheme="majorEastAsia"/>
+          <w:lang w:val="en-ID"/>
+        </w:rPr>
+        <w:t xml:space="preserve"> </w:t>
+      </w:r>
+      <w:proofErr w:type="spellStart"/>
+      <w:r>
+        <w:rPr>
+          <w:rFonts w:eastAsiaTheme="majorEastAsia"/>
+          <w:lang w:val="en-ID"/>
+        </w:rPr>
+        <w:t>memutus</w:t>
+      </w:r>
+      <w:proofErr w:type="spellEnd"/>
+      <w:r>
+        <w:rPr>
+          <w:rFonts w:eastAsiaTheme="majorEastAsia"/>
+          <w:lang w:val="en-ID"/>
+        </w:rPr>
+        <w:t xml:space="preserve"> </w:t>
+      </w:r>
+      <w:proofErr w:type="spellStart"/>
+      <w:r>
+        <w:rPr>
+          <w:rFonts w:eastAsiaTheme="majorEastAsia"/>
+          <w:lang w:val="en-ID"/>
+        </w:rPr>
+        <w:t>koneksi</w:t>
+      </w:r>
+      <w:proofErr w:type="spellEnd"/>
+      <w:r>
+        <w:rPr>
+          <w:rFonts w:eastAsiaTheme="majorEastAsia"/>
+          <w:lang w:val="en-ID"/>
+        </w:rPr>
+        <w:t xml:space="preserve"> dan </w:t>
+      </w:r>
+      <w:proofErr w:type="spellStart"/>
+      <w:r>
+        <w:rPr>
+          <w:rFonts w:eastAsiaTheme="majorEastAsia"/>
+          <w:lang w:val="en-ID"/>
+        </w:rPr>
+        <w:t>mengembalikan</w:t>
+      </w:r>
+      <w:proofErr w:type="spellEnd"/>
+      <w:r>
+        <w:rPr>
+          <w:rFonts w:eastAsiaTheme="majorEastAsia"/>
+          <w:lang w:val="en-ID"/>
+        </w:rPr>
+        <w:t xml:space="preserve"> </w:t>
+      </w:r>
+      <w:proofErr w:type="spellStart"/>
+      <w:r>
+        <w:rPr>
+          <w:rFonts w:eastAsiaTheme="majorEastAsia"/>
+          <w:lang w:val="en-ID"/>
+        </w:rPr>
+        <w:t>respons</w:t>
+      </w:r>
+      <w:proofErr w:type="spellEnd"/>
+      <w:r>
+        <w:rPr>
+          <w:rFonts w:eastAsiaTheme="majorEastAsia"/>
+          <w:lang w:val="en-ID"/>
+        </w:rPr>
+        <w:t xml:space="preserve"> HTTP 503 Service Unavailable </w:t>
+      </w:r>
+      <w:proofErr w:type="spellStart"/>
+      <w:r>
+        <w:rPr>
+          <w:rFonts w:eastAsiaTheme="majorEastAsia"/>
+          <w:lang w:val="en-ID"/>
+        </w:rPr>
+        <w:t>untuk</w:t>
+      </w:r>
+      <w:proofErr w:type="spellEnd"/>
+      <w:r>
+        <w:rPr>
+          <w:rFonts w:eastAsiaTheme="majorEastAsia"/>
+          <w:lang w:val="en-ID"/>
+        </w:rPr>
+        <w:t xml:space="preserve"> </w:t>
+      </w:r>
+      <w:proofErr w:type="spellStart"/>
+      <w:r>
+        <w:rPr>
+          <w:rFonts w:eastAsiaTheme="majorEastAsia"/>
+          <w:lang w:val="en-ID"/>
+        </w:rPr>
+        <w:t>rute</w:t>
+      </w:r>
+      <w:proofErr w:type="spellEnd"/>
+      <w:r>
+        <w:rPr>
+          <w:rFonts w:eastAsiaTheme="majorEastAsia"/>
+          <w:lang w:val="en-ID"/>
+        </w:rPr>
+        <w:t xml:space="preserve"> /</w:t>
+      </w:r>
+      <w:proofErr w:type="spellStart"/>
+      <w:r>
+        <w:rPr>
+          <w:rFonts w:eastAsiaTheme="majorEastAsia"/>
+          <w:lang w:val="en-ID"/>
+        </w:rPr>
+        <w:t>api</w:t>
+      </w:r>
+      <w:proofErr w:type="spellEnd"/>
+      <w:r>
+        <w:rPr>
+          <w:rFonts w:eastAsiaTheme="majorEastAsia"/>
+          <w:lang w:val="en-ID"/>
+        </w:rPr>
+        <w:t>/v1/</w:t>
+      </w:r>
+      <w:proofErr w:type="spellStart"/>
+      <w:r>
+        <w:rPr>
+          <w:rFonts w:eastAsiaTheme="majorEastAsia"/>
+          <w:lang w:val="en-ID"/>
+        </w:rPr>
+        <w:t>pajak</w:t>
+      </w:r>
+      <w:proofErr w:type="spellEnd"/>
+      <w:r>
+        <w:rPr>
+          <w:rFonts w:eastAsiaTheme="majorEastAsia"/>
+          <w:lang w:val="en-ID"/>
+        </w:rPr>
+        <w:t xml:space="preserve"> </w:t>
+      </w:r>
+      <w:proofErr w:type="spellStart"/>
+      <w:r>
+        <w:rPr>
+          <w:rFonts w:eastAsiaTheme="majorEastAsia"/>
+          <w:lang w:val="en-ID"/>
+        </w:rPr>
+        <w:t>tanpa</w:t>
+      </w:r>
+      <w:proofErr w:type="spellEnd"/>
+      <w:r>
+        <w:rPr>
+          <w:rFonts w:eastAsiaTheme="majorEastAsia"/>
+          <w:lang w:val="en-ID"/>
+        </w:rPr>
+        <w:t xml:space="preserve"> timeout (RTO = 0 </w:t>
+      </w:r>
+      <w:proofErr w:type="spellStart"/>
+      <w:r>
+        <w:rPr>
+          <w:rFonts w:eastAsiaTheme="majorEastAsia"/>
+          <w:lang w:val="en-ID"/>
+        </w:rPr>
+        <w:t>detik</w:t>
+      </w:r>
+      <w:proofErr w:type="spellEnd"/>
+      <w:r>
+        <w:rPr>
+          <w:rFonts w:eastAsiaTheme="majorEastAsia"/>
+          <w:lang w:val="en-ID"/>
+        </w:rPr>
+        <w:t>).</w:t>
       </w:r>
     </w:p>
     <w:p>
@@ -2670,7 +5572,135 @@
           <w:rFonts w:eastAsiaTheme="majorEastAsia"/>
           <w:lang w:val="en-ID"/>
         </w:rPr>
-        <w:t>Service Kependudukan tetap beroperasi 100% normal (HTTP 200 OK) tanpa mengalami penurunan performa sedikit pun.</w:t>
+        <w:t xml:space="preserve">Service </w:t>
+      </w:r>
+      <w:proofErr w:type="spellStart"/>
+      <w:r>
+        <w:rPr>
+          <w:rFonts w:eastAsiaTheme="majorEastAsia"/>
+          <w:lang w:val="en-ID"/>
+        </w:rPr>
+        <w:t>Kependudukan</w:t>
+      </w:r>
+      <w:proofErr w:type="spellEnd"/>
+      <w:r>
+        <w:rPr>
+          <w:rFonts w:eastAsiaTheme="majorEastAsia"/>
+          <w:lang w:val="en-ID"/>
+        </w:rPr>
+        <w:t xml:space="preserve"> </w:t>
+      </w:r>
+      <w:proofErr w:type="spellStart"/>
+      <w:r>
+        <w:rPr>
+          <w:rFonts w:eastAsiaTheme="majorEastAsia"/>
+          <w:lang w:val="en-ID"/>
+        </w:rPr>
+        <w:t>tetap</w:t>
+      </w:r>
+      <w:proofErr w:type="spellEnd"/>
+      <w:r>
+        <w:rPr>
+          <w:rFonts w:eastAsiaTheme="majorEastAsia"/>
+          <w:lang w:val="en-ID"/>
+        </w:rPr>
+        <w:t xml:space="preserve"> </w:t>
+      </w:r>
+      <w:proofErr w:type="spellStart"/>
+      <w:r>
+        <w:rPr>
+          <w:rFonts w:eastAsiaTheme="majorEastAsia"/>
+          <w:lang w:val="en-ID"/>
+        </w:rPr>
+        <w:t>beroperasi</w:t>
+      </w:r>
+      <w:proofErr w:type="spellEnd"/>
+      <w:r>
+        <w:rPr>
+          <w:rFonts w:eastAsiaTheme="majorEastAsia"/>
+          <w:lang w:val="en-ID"/>
+        </w:rPr>
+        <w:t xml:space="preserve"> 100% normal (HTTP 200 OK) </w:t>
+      </w:r>
+      <w:proofErr w:type="spellStart"/>
+      <w:r>
+        <w:rPr>
+          <w:rFonts w:eastAsiaTheme="majorEastAsia"/>
+          <w:lang w:val="en-ID"/>
+        </w:rPr>
+        <w:t>tanpa</w:t>
+      </w:r>
+      <w:proofErr w:type="spellEnd"/>
+      <w:r>
+        <w:rPr>
+          <w:rFonts w:eastAsiaTheme="majorEastAsia"/>
+          <w:lang w:val="en-ID"/>
+        </w:rPr>
+        <w:t xml:space="preserve"> </w:t>
+      </w:r>
+      <w:proofErr w:type="spellStart"/>
+      <w:r>
+        <w:rPr>
+          <w:rFonts w:eastAsiaTheme="majorEastAsia"/>
+          <w:lang w:val="en-ID"/>
+        </w:rPr>
+        <w:t>mengalami</w:t>
+      </w:r>
+      <w:proofErr w:type="spellEnd"/>
+      <w:r>
+        <w:rPr>
+          <w:rFonts w:eastAsiaTheme="majorEastAsia"/>
+          <w:lang w:val="en-ID"/>
+        </w:rPr>
+        <w:t xml:space="preserve"> </w:t>
+      </w:r>
+      <w:proofErr w:type="spellStart"/>
+      <w:r>
+        <w:rPr>
+          <w:rFonts w:eastAsiaTheme="majorEastAsia"/>
+          <w:lang w:val="en-ID"/>
+        </w:rPr>
+        <w:t>penurunan</w:t>
+      </w:r>
+      <w:proofErr w:type="spellEnd"/>
+      <w:r>
+        <w:rPr>
+          <w:rFonts w:eastAsiaTheme="majorEastAsia"/>
+          <w:lang w:val="en-ID"/>
+        </w:rPr>
+        <w:t xml:space="preserve"> </w:t>
+      </w:r>
+      <w:proofErr w:type="spellStart"/>
+      <w:r>
+        <w:rPr>
+          <w:rFonts w:eastAsiaTheme="majorEastAsia"/>
+          <w:lang w:val="en-ID"/>
+        </w:rPr>
+        <w:t>performa</w:t>
+      </w:r>
+      <w:proofErr w:type="spellEnd"/>
+      <w:r>
+        <w:rPr>
+          <w:rFonts w:eastAsiaTheme="majorEastAsia"/>
+          <w:lang w:val="en-ID"/>
+        </w:rPr>
+        <w:t xml:space="preserve"> </w:t>
+      </w:r>
+      <w:proofErr w:type="spellStart"/>
+      <w:r>
+        <w:rPr>
+          <w:rFonts w:eastAsiaTheme="majorEastAsia"/>
+          <w:lang w:val="en-ID"/>
+        </w:rPr>
+        <w:t>sedikit</w:t>
+      </w:r>
+      <w:proofErr w:type="spellEnd"/>
+      <w:r>
+        <w:rPr>
+          <w:rFonts w:eastAsiaTheme="majorEastAsia"/>
+          <w:lang w:val="en-ID"/>
+        </w:rPr>
+        <w:t xml:space="preserve"> pun.</w:t>
       </w:r>
     </w:p>
     <w:p>
@@ -2701,6 +5731,7 @@
         <w:rPr>
           <w:lang w:val="en-ID"/>
         </w:rPr>
+        <w:lastRenderedPageBreak/>
         <w:t>BAB VI</w:t>
       </w:r>
     </w:p>
@@ -2734,11 +5765,61 @@
         </w:rPr>
         <w:t xml:space="preserve">6.1 </w:t>
       </w:r>
-      <w:r>
-        <w:rPr>
-          <w:lang w:val="en-ID"/>
-        </w:rPr>
-        <w:t>Pembagian Tugas Anggota Kelompok (4 Orang)</w:t>
+      <w:proofErr w:type="spellStart"/>
+      <w:r>
+        <w:rPr>
+          <w:lang w:val="en-ID"/>
+        </w:rPr>
+        <w:t>Pembagian</w:t>
+      </w:r>
+      <w:proofErr w:type="spellEnd"/>
+      <w:r>
+        <w:rPr>
+          <w:lang w:val="en-ID"/>
+        </w:rPr>
+        <w:t xml:space="preserve"> </w:t>
+      </w:r>
+      <w:proofErr w:type="spellStart"/>
+      <w:r>
+        <w:rPr>
+          <w:lang w:val="en-ID"/>
+        </w:rPr>
+        <w:t>Tugas</w:t>
+      </w:r>
+      <w:proofErr w:type="spellEnd"/>
+      <w:r>
+        <w:rPr>
+          <w:lang w:val="en-ID"/>
+        </w:rPr>
+        <w:t xml:space="preserve"> </w:t>
+      </w:r>
+      <w:proofErr w:type="spellStart"/>
+      <w:r>
+        <w:rPr>
+          <w:lang w:val="en-ID"/>
+        </w:rPr>
+        <w:t>Anggota</w:t>
+      </w:r>
+      <w:proofErr w:type="spellEnd"/>
+      <w:r>
+        <w:rPr>
+          <w:lang w:val="en-ID"/>
+        </w:rPr>
+        <w:t xml:space="preserve"> </w:t>
+      </w:r>
+      <w:proofErr w:type="spellStart"/>
+      <w:r>
+        <w:rPr>
+          <w:lang w:val="en-ID"/>
+        </w:rPr>
+        <w:t>Kelompok</w:t>
+      </w:r>
+      <w:proofErr w:type="spellEnd"/>
+      <w:r>
+        <w:rPr>
+          <w:lang w:val="en-ID"/>
+        </w:rPr>
+        <w:t xml:space="preserve"> (4 Orang)</w:t>
       </w:r>
     </w:p>
     <w:tbl>
@@ -3274,11 +6355,47 @@
         <w:lastRenderedPageBreak/>
         <w:t xml:space="preserve">6.2 </w:t>
       </w:r>
-      <w:r>
-        <w:rPr>
-          <w:lang w:val="en-ID"/>
-        </w:rPr>
-        <w:t>Tautan Repositori Proyek (GitHub)</w:t>
+      <w:proofErr w:type="spellStart"/>
+      <w:r>
+        <w:rPr>
+          <w:lang w:val="en-ID"/>
+        </w:rPr>
+        <w:t>Tautan</w:t>
+      </w:r>
+      <w:proofErr w:type="spellEnd"/>
+      <w:r>
+        <w:rPr>
+          <w:lang w:val="en-ID"/>
+        </w:rPr>
+        <w:t xml:space="preserve"> </w:t>
+      </w:r>
+      <w:proofErr w:type="spellStart"/>
+      <w:r>
+        <w:rPr>
+          <w:lang w:val="en-ID"/>
+        </w:rPr>
+        <w:t>Repositori</w:t>
+      </w:r>
+      <w:proofErr w:type="spellEnd"/>
+      <w:r>
+        <w:rPr>
+          <w:lang w:val="en-ID"/>
+        </w:rPr>
+        <w:t xml:space="preserve"> </w:t>
+      </w:r>
+      <w:proofErr w:type="spellStart"/>
+      <w:r>
+        <w:rPr>
+          <w:lang w:val="en-ID"/>
+        </w:rPr>
+        <w:t>Proyek</w:t>
+      </w:r>
+      <w:proofErr w:type="spellEnd"/>
+      <w:r>
+        <w:rPr>
+          <w:lang w:val="en-ID"/>
+        </w:rPr>
+        <w:t xml:space="preserve"> (GitHub)</w:t>
       </w:r>
     </w:p>
     <w:p>
@@ -3293,14 +6410,23 @@
           <w:lang w:val="en-ID"/>
         </w:rPr>
       </w:pPr>
-      <w:r>
-        <w:rPr>
-          <w:rFonts w:eastAsiaTheme="majorEastAsia"/>
-          <w:lang w:val="en-ID"/>
-        </w:rPr>
-        <w:t>Tautan Repositori: </w:t>
-      </w:r>
-      <w:hyperlink r:id="rId10" w:history="1">
+      <w:proofErr w:type="spellStart"/>
+      <w:r>
+        <w:rPr>
+          <w:rFonts w:eastAsiaTheme="majorEastAsia"/>
+          <w:lang w:val="en-ID"/>
+        </w:rPr>
+        <w:t>Tautan</w:t>
+      </w:r>
+      <w:proofErr w:type="spellEnd"/>
+      <w:r>
+        <w:rPr>
+          <w:rFonts w:eastAsiaTheme="majorEastAsia"/>
+          <w:lang w:val="en-ID"/>
+        </w:rPr>
+        <w:t xml:space="preserve"> Repositori: </w:t>
+      </w:r>
+      <w:hyperlink r:id="rId13" w:history="1">
         <w:r>
           <w:rPr>
             <w:rStyle w:val="Hyperlink"/>
@@ -3344,7 +6470,39 @@
           <w:rFonts w:eastAsiaTheme="majorEastAsia"/>
           <w:lang w:val="en-ID"/>
         </w:rPr>
-        <w:t> (Teruji secara lokal pada Docker Desktop).</w:t>
+        <w:t xml:space="preserve"> (Teruji </w:t>
+      </w:r>
+      <w:proofErr w:type="spellStart"/>
+      <w:r>
+        <w:rPr>
+          <w:rFonts w:eastAsiaTheme="majorEastAsia"/>
+          <w:lang w:val="en-ID"/>
+        </w:rPr>
+        <w:t>secara</w:t>
+      </w:r>
+      <w:proofErr w:type="spellEnd"/>
+      <w:r>
+        <w:rPr>
+          <w:rFonts w:eastAsiaTheme="majorEastAsia"/>
+          <w:lang w:val="en-ID"/>
+        </w:rPr>
+        <w:t xml:space="preserve"> </w:t>
+      </w:r>
+      <w:proofErr w:type="spellStart"/>
+      <w:r>
+        <w:rPr>
+          <w:rFonts w:eastAsiaTheme="majorEastAsia"/>
+          <w:lang w:val="en-ID"/>
+        </w:rPr>
+        <w:t>lokal</w:t>
+      </w:r>
+      <w:proofErr w:type="spellEnd"/>
+      <w:r>
+        <w:rPr>
+          <w:rFonts w:eastAsiaTheme="majorEastAsia"/>
+          <w:lang w:val="en-ID"/>
+        </w:rPr>
+        <w:t xml:space="preserve"> pada Docker Desktop).</w:t>
       </w:r>
     </w:p>
     <w:sectPr>
@@ -3410,6 +6568,95 @@
 <file path=word/numbering.xml><?xml version="1.0" encoding="utf-8"?>
 <w:numbering xmlns:wpc="http://schemas.microsoft.com/office/word/2010/wordprocessingCanvas" xmlns:cx="http://schemas.microsoft.com/office/drawing/2014/chartex" xmlns:cx1="http://schemas.microsoft.com/office/drawing/2015/9/8/chartex" xmlns:cx2="http://schemas.microsoft.com/office/drawing/2015/10/21/chartex" xmlns:cx3="http://schemas.microsoft.com/office/drawing/2016/5/9/chartex" xmlns:cx4="http://schemas.microsoft.com/office/drawing/2016/5/10/chartex" xmlns:cx5="http://schemas.microsoft.com/office/drawing/2016/5/11/chartex" xmlns:cx6="http://schemas.microsoft.com/office/drawing/2016/5/12/chartex" xmlns:cx7="http://schemas.microsoft.com/office/drawing/2016/5/13/chartex" xmlns:cx8="http://schemas.microsoft.com/office/drawing/2016/5/14/chartex" xmlns:mc="http://schemas.openxmlformats.org/markup-compatibility/2006" xmlns:aink="http://schemas.microsoft.com/office/drawing/2016/ink" xmlns:am3d="http://schemas.microsoft.com/office/drawing/2017/model3d" xmlns:o="urn:schemas-microsoft-com:office:office" xmlns:oel="http://schemas.microsoft.com/office/2019/extlst" xmlns:r="http://schemas.openxmlformats.org/officeDocument/2006/relationships" xmlns:m="http://schemas.openxmlformats.org/officeDocument/2006/math" xmlns:v="urn:schemas-microsoft-com:vml" xmlns:wp14="http://schemas.microsoft.com/office/word/2010/wordprocessingDrawing" xmlns:wp="http://schemas.openxmlformats.org/drawingml/2006/wordprocessingDrawing" xmlns:w10="urn:schemas-microsoft-com:office:word" xmlns:w="http://schemas.openxmlformats.org/wordprocessingml/2006/main" xmlns:w14="http://schemas.microsoft.com/office/word/2010/wordml" xmlns:w15="http://schemas.microsoft.com/office/word/2012/wordml" xmlns:w16cex="http://schemas.microsoft.com/office/word/2018/wordml/cex" xmlns:w16cid="http://schemas.microsoft.com/office/word/2016/wordml/cid" xmlns:w16="http://schemas.microsoft.com/office/word/2018/wordml" xmlns:w16du="http://schemas.microsoft.com/office/word/2023/wordml/word16du" xmlns:w16sdtdh="http://schemas.microsoft.com/office/word/2020/wordml/sdtdatahash" xmlns:w16sdtfl="http://schemas.microsoft.com/office/word/2024/wordml/sdtformatlock" xmlns:w16se="http://schemas.microsoft.com/office/word/2015/wordml/symex" xmlns:wpg="http://schemas.microsoft.com/office/word/2010/wordprocessingGroup" xmlns:wpi="http://schemas.microsoft.com/office/word/2010/wordprocessingInk" xmlns:wne="http://schemas.microsoft.com/office/word/2006/wordml" xmlns:wps="http://schemas.microsoft.com/office/word/2010/wordprocessingShape" mc:Ignorable="w14 w15 w16se w16cid w16 w16cex w16sdtdh w16sdtfl w16du wp14">
   <w:abstractNum w:abstractNumId="0" w15:restartNumberingAfterBreak="0">
+    <w:nsid w:val="0DF809BE"/>
+    <w:multiLevelType w:val="hybridMultilevel"/>
+    <w:tmpl w:val="AE46312A"/>
+    <w:lvl w:ilvl="0" w:tplc="3809000F">
+      <w:start w:val="1"/>
+      <w:numFmt w:val="decimal"/>
+      <w:lvlText w:val="%1."/>
+      <w:lvlJc w:val="left"/>
+      <w:pPr>
+        <w:ind w:left="720" w:hanging="360"/>
+      </w:pPr>
+      <w:rPr>
+        <w:rFonts w:hint="default"/>
+      </w:rPr>
+    </w:lvl>
+    <w:lvl w:ilvl="1" w:tplc="38090019" w:tentative="1">
+      <w:start w:val="1"/>
+      <w:numFmt w:val="lowerLetter"/>
+      <w:lvlText w:val="%2."/>
+      <w:lvlJc w:val="left"/>
+      <w:pPr>
+        <w:ind w:left="1440" w:hanging="360"/>
+      </w:pPr>
+    </w:lvl>
+    <w:lvl w:ilvl="2" w:tplc="3809001B" w:tentative="1">
+      <w:start w:val="1"/>
+      <w:numFmt w:val="lowerRoman"/>
+      <w:lvlText w:val="%3."/>
+      <w:lvlJc w:val="right"/>
+      <w:pPr>
+        <w:ind w:left="2160" w:hanging="180"/>
+      </w:pPr>
+    </w:lvl>
+    <w:lvl w:ilvl="3" w:tplc="3809000F" w:tentative="1">
+      <w:start w:val="1"/>
+      <w:numFmt w:val="decimal"/>
+      <w:lvlText w:val="%4."/>
+      <w:lvlJc w:val="left"/>
+      <w:pPr>
+        <w:ind w:left="2880" w:hanging="360"/>
+      </w:pPr>
+    </w:lvl>
+    <w:lvl w:ilvl="4" w:tplc="38090019" w:tentative="1">
+      <w:start w:val="1"/>
+      <w:numFmt w:val="lowerLetter"/>
+      <w:lvlText w:val="%5."/>
+      <w:lvlJc w:val="left"/>
+      <w:pPr>
+        <w:ind w:left="3600" w:hanging="360"/>
+      </w:pPr>
+    </w:lvl>
+    <w:lvl w:ilvl="5" w:tplc="3809001B" w:tentative="1">
+      <w:start w:val="1"/>
+      <w:numFmt w:val="lowerRoman"/>
+      <w:lvlText w:val="%6."/>
+      <w:lvlJc w:val="right"/>
+      <w:pPr>
+        <w:ind w:left="4320" w:hanging="180"/>
+      </w:pPr>
+    </w:lvl>
+    <w:lvl w:ilvl="6" w:tplc="3809000F" w:tentative="1">
+      <w:start w:val="1"/>
+      <w:numFmt w:val="decimal"/>
+      <w:lvlText w:val="%7."/>
+      <w:lvlJc w:val="left"/>
+      <w:pPr>
+        <w:ind w:left="5040" w:hanging="360"/>
+      </w:pPr>
+    </w:lvl>
+    <w:lvl w:ilvl="7" w:tplc="38090019" w:tentative="1">
+      <w:start w:val="1"/>
+      <w:numFmt w:val="lowerLetter"/>
+      <w:lvlText w:val="%8."/>
+      <w:lvlJc w:val="left"/>
+      <w:pPr>
+        <w:ind w:left="5760" w:hanging="360"/>
+      </w:pPr>
+    </w:lvl>
+    <w:lvl w:ilvl="8" w:tplc="3809001B" w:tentative="1">
+      <w:start w:val="1"/>
+      <w:numFmt w:val="lowerRoman"/>
+      <w:lvlText w:val="%9."/>
+      <w:lvlJc w:val="right"/>
+      <w:pPr>
+        <w:ind w:left="6480" w:hanging="180"/>
+      </w:pPr>
+    </w:lvl>
+  </w:abstractNum>
+  <w:abstractNum w:abstractNumId="1" w15:restartNumberingAfterBreak="0">
     <w:nsid w:val="0E0D3F2F"/>
     <w:multiLevelType w:val="multilevel"/>
     <w:tmpl w:val="815650D8"/>
@@ -3522,7 +6769,7 @@
       </w:rPr>
     </w:lvl>
   </w:abstractNum>
-  <w:abstractNum w:abstractNumId="1" w15:restartNumberingAfterBreak="0">
+  <w:abstractNum w:abstractNumId="2" w15:restartNumberingAfterBreak="0">
     <w:nsid w:val="11940B82"/>
     <w:multiLevelType w:val="hybridMultilevel"/>
     <w:tmpl w:val="92EAAC0E"/>
@@ -3611,7 +6858,7 @@
       </w:pPr>
     </w:lvl>
   </w:abstractNum>
-  <w:abstractNum w:abstractNumId="2" w15:restartNumberingAfterBreak="0">
+  <w:abstractNum w:abstractNumId="3" w15:restartNumberingAfterBreak="0">
     <w:nsid w:val="18A52A38"/>
     <w:multiLevelType w:val="hybridMultilevel"/>
     <w:tmpl w:val="A91C3522"/>
@@ -3724,7 +6971,7 @@
       </w:rPr>
     </w:lvl>
   </w:abstractNum>
-  <w:abstractNum w:abstractNumId="3" w15:restartNumberingAfterBreak="0">
+  <w:abstractNum w:abstractNumId="4" w15:restartNumberingAfterBreak="0">
     <w:nsid w:val="1C911D54"/>
     <w:multiLevelType w:val="hybridMultilevel"/>
     <w:tmpl w:val="AEFC9D3C"/>
@@ -3837,7 +7084,7 @@
       </w:rPr>
     </w:lvl>
   </w:abstractNum>
-  <w:abstractNum w:abstractNumId="4" w15:restartNumberingAfterBreak="0">
+  <w:abstractNum w:abstractNumId="5" w15:restartNumberingAfterBreak="0">
     <w:nsid w:val="1EA725C0"/>
     <w:multiLevelType w:val="hybridMultilevel"/>
     <w:tmpl w:val="A258807C"/>
@@ -3926,7 +7173,120 @@
       </w:pPr>
     </w:lvl>
   </w:abstractNum>
-  <w:abstractNum w:abstractNumId="5" w15:restartNumberingAfterBreak="0">
+  <w:abstractNum w:abstractNumId="6" w15:restartNumberingAfterBreak="0">
+    <w:nsid w:val="2529579C"/>
+    <w:multiLevelType w:val="multilevel"/>
+    <w:tmpl w:val="99200332"/>
+    <w:lvl w:ilvl="0">
+      <w:start w:val="1"/>
+      <w:numFmt w:val="decimal"/>
+      <w:lvlText w:val="%1."/>
+      <w:lvlJc w:val="left"/>
+      <w:pPr>
+        <w:tabs>
+          <w:tab w:val="num" w:pos="1080"/>
+        </w:tabs>
+        <w:ind w:left="1080" w:hanging="360"/>
+      </w:pPr>
+    </w:lvl>
+    <w:lvl w:ilvl="1" w:tentative="1">
+      <w:start w:val="1"/>
+      <w:numFmt w:val="decimal"/>
+      <w:lvlText w:val="%2."/>
+      <w:lvlJc w:val="left"/>
+      <w:pPr>
+        <w:tabs>
+          <w:tab w:val="num" w:pos="1800"/>
+        </w:tabs>
+        <w:ind w:left="1800" w:hanging="360"/>
+      </w:pPr>
+    </w:lvl>
+    <w:lvl w:ilvl="2" w:tentative="1">
+      <w:start w:val="1"/>
+      <w:numFmt w:val="decimal"/>
+      <w:lvlText w:val="%3."/>
+      <w:lvlJc w:val="left"/>
+      <w:pPr>
+        <w:tabs>
+          <w:tab w:val="num" w:pos="2520"/>
+        </w:tabs>
+        <w:ind w:left="2520" w:hanging="360"/>
+      </w:pPr>
+    </w:lvl>
+    <w:lvl w:ilvl="3" w:tentative="1">
+      <w:start w:val="1"/>
+      <w:numFmt w:val="decimal"/>
+      <w:lvlText w:val="%4."/>
+      <w:lvlJc w:val="left"/>
+      <w:pPr>
+        <w:tabs>
+          <w:tab w:val="num" w:pos="3240"/>
+        </w:tabs>
+        <w:ind w:left="3240" w:hanging="360"/>
+      </w:pPr>
+    </w:lvl>
+    <w:lvl w:ilvl="4" w:tentative="1">
+      <w:start w:val="1"/>
+      <w:numFmt w:val="decimal"/>
+      <w:lvlText w:val="%5."/>
+      <w:lvlJc w:val="left"/>
+      <w:pPr>
+        <w:tabs>
+          <w:tab w:val="num" w:pos="3960"/>
+        </w:tabs>
+        <w:ind w:left="3960" w:hanging="360"/>
+      </w:pPr>
+    </w:lvl>
+    <w:lvl w:ilvl="5" w:tentative="1">
+      <w:start w:val="1"/>
+      <w:numFmt w:val="decimal"/>
+      <w:lvlText w:val="%6."/>
+      <w:lvlJc w:val="left"/>
+      <w:pPr>
+        <w:tabs>
+          <w:tab w:val="num" w:pos="4680"/>
+        </w:tabs>
+        <w:ind w:left="4680" w:hanging="360"/>
+      </w:pPr>
+    </w:lvl>
+    <w:lvl w:ilvl="6" w:tentative="1">
+      <w:start w:val="1"/>
+      <w:numFmt w:val="decimal"/>
+      <w:lvlText w:val="%7."/>
+      <w:lvlJc w:val="left"/>
+      <w:pPr>
+        <w:tabs>
+          <w:tab w:val="num" w:pos="5400"/>
+        </w:tabs>
+        <w:ind w:left="5400" w:hanging="360"/>
+      </w:pPr>
+    </w:lvl>
+    <w:lvl w:ilvl="7" w:tentative="1">
+      <w:start w:val="1"/>
+      <w:numFmt w:val="decimal"/>
+      <w:lvlText w:val="%8."/>
+      <w:lvlJc w:val="left"/>
+      <w:pPr>
+        <w:tabs>
+          <w:tab w:val="num" w:pos="6120"/>
+        </w:tabs>
+        <w:ind w:left="6120" w:hanging="360"/>
+      </w:pPr>
+    </w:lvl>
+    <w:lvl w:ilvl="8" w:tentative="1">
+      <w:start w:val="1"/>
+      <w:numFmt w:val="decimal"/>
+      <w:lvlText w:val="%9."/>
+      <w:lvlJc w:val="left"/>
+      <w:pPr>
+        <w:tabs>
+          <w:tab w:val="num" w:pos="6840"/>
+        </w:tabs>
+        <w:ind w:left="6840" w:hanging="360"/>
+      </w:pPr>
+    </w:lvl>
+  </w:abstractNum>
+  <w:abstractNum w:abstractNumId="7" w15:restartNumberingAfterBreak="0">
     <w:nsid w:val="2EFD6413"/>
     <w:multiLevelType w:val="hybridMultilevel"/>
     <w:tmpl w:val="FCECA7F8"/>
@@ -4039,7 +7399,7 @@
       </w:rPr>
     </w:lvl>
   </w:abstractNum>
-  <w:abstractNum w:abstractNumId="6" w15:restartNumberingAfterBreak="0">
+  <w:abstractNum w:abstractNumId="8" w15:restartNumberingAfterBreak="0">
     <w:nsid w:val="317E63AD"/>
     <w:multiLevelType w:val="hybridMultilevel"/>
     <w:tmpl w:val="222A1648"/>
@@ -4128,7 +7488,7 @@
       </w:pPr>
     </w:lvl>
   </w:abstractNum>
-  <w:abstractNum w:abstractNumId="7" w15:restartNumberingAfterBreak="0">
+  <w:abstractNum w:abstractNumId="9" w15:restartNumberingAfterBreak="0">
     <w:nsid w:val="359024BE"/>
     <w:multiLevelType w:val="hybridMultilevel"/>
     <w:tmpl w:val="29D8CA46"/>
@@ -4217,7 +7577,7 @@
       </w:pPr>
     </w:lvl>
   </w:abstractNum>
-  <w:abstractNum w:abstractNumId="8" w15:restartNumberingAfterBreak="0">
+  <w:abstractNum w:abstractNumId="10" w15:restartNumberingAfterBreak="0">
     <w:nsid w:val="3B2A0B59"/>
     <w:multiLevelType w:val="multilevel"/>
     <w:tmpl w:val="FB383A7C"/>
@@ -4366,7 +7726,7 @@
       </w:rPr>
     </w:lvl>
   </w:abstractNum>
-  <w:abstractNum w:abstractNumId="9" w15:restartNumberingAfterBreak="0">
+  <w:abstractNum w:abstractNumId="11" w15:restartNumberingAfterBreak="0">
     <w:nsid w:val="42405827"/>
     <w:multiLevelType w:val="hybridMultilevel"/>
     <w:tmpl w:val="1D1C179A"/>
@@ -4479,7 +7839,7 @@
       </w:rPr>
     </w:lvl>
   </w:abstractNum>
-  <w:abstractNum w:abstractNumId="10" w15:restartNumberingAfterBreak="0">
+  <w:abstractNum w:abstractNumId="12" w15:restartNumberingAfterBreak="0">
     <w:nsid w:val="5BB2030C"/>
     <w:multiLevelType w:val="hybridMultilevel"/>
     <w:tmpl w:val="1E945F8C"/>
@@ -4592,7 +7952,7 @@
       </w:rPr>
     </w:lvl>
   </w:abstractNum>
-  <w:abstractNum w:abstractNumId="11" w15:restartNumberingAfterBreak="0">
+  <w:abstractNum w:abstractNumId="13" w15:restartNumberingAfterBreak="0">
     <w:nsid w:val="5BC152FB"/>
     <w:multiLevelType w:val="hybridMultilevel"/>
     <w:tmpl w:val="69F2C04E"/>
@@ -4679,40 +8039,46 @@
     </w:lvl>
   </w:abstractNum>
   <w:num w:numId="1" w16cid:durableId="673189952">
-    <w:abstractNumId w:val="6"/>
+    <w:abstractNumId w:val="8"/>
   </w:num>
   <w:num w:numId="2" w16cid:durableId="2120223208">
+    <w:abstractNumId w:val="1"/>
+  </w:num>
+  <w:num w:numId="3" w16cid:durableId="180317151">
+    <w:abstractNumId w:val="9"/>
+  </w:num>
+  <w:num w:numId="4" w16cid:durableId="1095250828">
+    <w:abstractNumId w:val="5"/>
+  </w:num>
+  <w:num w:numId="5" w16cid:durableId="688412679">
+    <w:abstractNumId w:val="13"/>
+  </w:num>
+  <w:num w:numId="6" w16cid:durableId="1041898766">
+    <w:abstractNumId w:val="2"/>
+  </w:num>
+  <w:num w:numId="7" w16cid:durableId="531235290">
+    <w:abstractNumId w:val="7"/>
+  </w:num>
+  <w:num w:numId="8" w16cid:durableId="751926561">
+    <w:abstractNumId w:val="4"/>
+  </w:num>
+  <w:num w:numId="9" w16cid:durableId="684359595">
+    <w:abstractNumId w:val="3"/>
+  </w:num>
+  <w:num w:numId="10" w16cid:durableId="1002585701">
+    <w:abstractNumId w:val="12"/>
+  </w:num>
+  <w:num w:numId="11" w16cid:durableId="765420618">
+    <w:abstractNumId w:val="11"/>
+  </w:num>
+  <w:num w:numId="12" w16cid:durableId="254554954">
+    <w:abstractNumId w:val="10"/>
+  </w:num>
+  <w:num w:numId="13" w16cid:durableId="969020672">
     <w:abstractNumId w:val="0"/>
   </w:num>
-  <w:num w:numId="3" w16cid:durableId="180317151">
-    <w:abstractNumId w:val="7"/>
-  </w:num>
-  <w:num w:numId="4" w16cid:durableId="1095250828">
-    <w:abstractNumId w:val="4"/>
-  </w:num>
-  <w:num w:numId="5" w16cid:durableId="688412679">
-    <w:abstractNumId w:val="11"/>
-  </w:num>
-  <w:num w:numId="6" w16cid:durableId="1041898766">
-    <w:abstractNumId w:val="1"/>
-  </w:num>
-  <w:num w:numId="7" w16cid:durableId="531235290">
-    <w:abstractNumId w:val="5"/>
-  </w:num>
-  <w:num w:numId="8" w16cid:durableId="751926561">
-    <w:abstractNumId w:val="3"/>
-  </w:num>
-  <w:num w:numId="9" w16cid:durableId="684359595">
-    <w:abstractNumId w:val="2"/>
-  </w:num>
-  <w:num w:numId="10" w16cid:durableId="1002585701">
-    <w:abstractNumId w:val="10"/>
-  </w:num>
-  <w:num w:numId="11" w16cid:durableId="765420618">
-    <w:abstractNumId w:val="9"/>
-  </w:num>
-  <w:num w:numId="12" w16cid:durableId="254554954">
-    <w:abstractNumId w:val="8"/>
+  <w:num w:numId="14" w16cid:durableId="1723946771">
+    <w:abstractNumId w:val="6"/>
   </w:num>
 </w:numbering>
 </file>
@@ -5333,7 +8699,6 @@
   <w:style w:type="character" w:default="1" w:styleId="DefaultParagraphFont">
     <w:name w:val="Default Paragraph Font"/>
     <w:uiPriority w:val="1"/>
-    <w:semiHidden/>
     <w:unhideWhenUsed/>
   </w:style>
   <w:style w:type="table" w:default="1" w:styleId="TableNormal">

</xml_diff>